<commit_message>
fix docx-generation Domain & add first template
</commit_message>
<xml_diff>
--- a/public/template/2. Tờ trình phê duyệt KHLCNT.docx
+++ b/public/template/2. Tờ trình phê duyệt KHLCNT.docx
@@ -5,7 +5,7 @@
     <w:tbl>
       <w:tblPr>
         <w:tblStyle w:val="5"/>
-        <w:tblW w:w="10469" w:type="dxa"/>
+        <w:tblW w:w="10360" w:type="dxa"/>
         <w:tblInd w:w="-732" w:type="dxa"/>
         <w:tblLayout w:type="autofit"/>
         <w:tblCellMar>
@@ -16,8 +16,8 @@
         </w:tblCellMar>
       </w:tblPr>
       <w:tblGrid>
-        <w:gridCol w:w="4620"/>
-        <w:gridCol w:w="5849"/>
+        <w:gridCol w:w="4526"/>
+        <w:gridCol w:w="5834"/>
       </w:tblGrid>
       <w:tr>
         <w:tblPrEx>
@@ -30,7 +30,8 @@
         </w:tblPrEx>
         <w:tc>
           <w:tcPr>
-            <w:tcW w:w="4620" w:type="dxa"/>
+            <w:tcW w:w="4526" w:type="dxa"/>
+            <w:shd w:val="clear" w:color="auto" w:fill="auto"/>
             <w:noWrap w:val="0"/>
             <w:vAlign w:val="top"/>
           </w:tcPr>
@@ -61,7 +62,8 @@
         </w:tc>
         <w:tc>
           <w:tcPr>
-            <w:tcW w:w="5849" w:type="dxa"/>
+            <w:tcW w:w="5834" w:type="dxa"/>
+            <w:shd w:val="clear" w:color="auto" w:fill="auto"/>
             <w:noWrap w:val="0"/>
             <w:vAlign w:val="top"/>
           </w:tcPr>
@@ -106,7 +108,8 @@
         </w:tblPrEx>
         <w:tc>
           <w:tcPr>
-            <w:tcW w:w="4620" w:type="dxa"/>
+            <w:tcW w:w="4526" w:type="dxa"/>
+            <w:shd w:val="clear" w:color="auto" w:fill="auto"/>
             <w:noWrap w:val="0"/>
             <w:vAlign w:val="top"/>
           </w:tcPr>
@@ -141,7 +144,8 @@
         </w:tc>
         <w:tc>
           <w:tcPr>
-            <w:tcW w:w="5849" w:type="dxa"/>
+            <w:tcW w:w="5834" w:type="dxa"/>
+            <w:shd w:val="clear" w:color="auto" w:fill="auto"/>
             <w:noWrap w:val="0"/>
             <w:vAlign w:val="top"/>
           </w:tcPr>
@@ -189,7 +193,8 @@
         </w:trPr>
         <w:tc>
           <w:tcPr>
-            <w:tcW w:w="4620" w:type="dxa"/>
+            <w:tcW w:w="4526" w:type="dxa"/>
+            <w:shd w:val="clear" w:color="auto" w:fill="auto"/>
             <w:noWrap w:val="0"/>
             <w:vAlign w:val="top"/>
           </w:tcPr>
@@ -282,6 +287,7 @@
                 <w:rFonts w:hint="default" w:ascii="Times New Roman" w:hAnsi="Times New Roman" w:cs="Times New Roman"/>
                 <w:sz w:val="26"/>
                 <w:szCs w:val="26"/>
+                <w:lang w:val="en-US"/>
               </w:rPr>
             </w:pPr>
             <w:r>
@@ -290,42 +296,24 @@
                 <w:sz w:val="26"/>
                 <w:szCs w:val="26"/>
               </w:rPr>
-              <w:t xml:space="preserve">Số:  </w:t>
-            </w:r>
-            <w:r>
-              <w:rPr>
-                <w:rFonts w:hint="default" w:ascii="Times New Roman" w:hAnsi="Times New Roman" w:cs="Times New Roman"/>
-                <w:sz w:val="26"/>
-                <w:szCs w:val="26"/>
-                <w:lang w:val="en-US"/>
-              </w:rPr>
-              <w:t>{</w:t>
+              <w:t xml:space="preserve">Số: </w:t>
             </w:r>
             <w:r>
               <w:rPr>
                 <w:rFonts w:hint="default" w:cs="Times New Roman"/>
                 <w:sz w:val="26"/>
                 <w:szCs w:val="26"/>
+                <w:highlight w:val="yellow"/>
                 <w:lang w:val="en-US"/>
               </w:rPr>
-              <w:t>no</w:t>
-            </w:r>
-            <w:bookmarkStart w:id="3" w:name="_GoBack"/>
-            <w:bookmarkEnd w:id="3"/>
-            <w:r>
-              <w:rPr>
-                <w:rFonts w:hint="default" w:ascii="Times New Roman" w:hAnsi="Times New Roman" w:cs="Times New Roman"/>
-                <w:sz w:val="26"/>
-                <w:szCs w:val="26"/>
-                <w:lang w:val="en-US"/>
-              </w:rPr>
-              <w:t>}</w:t>
+              <w:t>{no}</w:t>
             </w:r>
           </w:p>
         </w:tc>
         <w:tc>
           <w:tcPr>
-            <w:tcW w:w="5849" w:type="dxa"/>
+            <w:tcW w:w="5834" w:type="dxa"/>
+            <w:shd w:val="clear" w:color="auto" w:fill="auto"/>
             <w:noWrap w:val="0"/>
             <w:vAlign w:val="top"/>
           </w:tcPr>
@@ -446,6 +434,7 @@
                 <w:iCs/>
                 <w:sz w:val="26"/>
                 <w:szCs w:val="26"/>
+                <w:highlight w:val="yellow"/>
                 <w:lang w:val="en-US"/>
               </w:rPr>
               <w:t>{date}</w:t>
@@ -525,7 +514,7 @@
           <w:bCs/>
           <w:i/>
         </w:rPr>
-        <w:t xml:space="preserve">Tư vấn lập Báo cáo kinh tế kỹ thuật” </w:t>
+        <w:t xml:space="preserve">Tư vấn lập BCKTKT” </w:t>
       </w:r>
     </w:p>
     <w:p>
@@ -565,7 +554,7 @@
           <w:bCs/>
           <w:i/>
         </w:rPr>
-        <w:t>“Thẩm tra Báo cáo kinh tế kỹ thuật”</w:t>
+        <w:t>“Tư vấn Thẩm tra BCKTKT”</w:t>
       </w:r>
     </w:p>
     <w:p>
@@ -585,33 +574,32 @@
           <w:sz w:val="28"/>
           <w:szCs w:val="28"/>
         </w:rPr>
-        <w:t xml:space="preserve">Công trình: </w:t>
-      </w:r>
-      <w:r>
-        <w:rPr>
-          <w:rFonts w:ascii="Times New Roman" w:hAnsi="Times New Roman"/>
+        <w:t>Công trình: “</w:t>
+      </w:r>
+      <w:r>
+        <w:rPr>
+          <w:rFonts w:hint="default" w:ascii="Times New Roman" w:hAnsi="Times New Roman"/>
           <w:bCs w:val="0"/>
-          <w:i/>
           <w:sz w:val="28"/>
           <w:szCs w:val="28"/>
-        </w:rPr>
-        <w:t>“</w:t>
+          <w:highlight w:val="yellow"/>
+          <w:lang w:val="en-US"/>
+        </w:rPr>
+        <w:t>{</w:t>
       </w:r>
       <w:r>
         <w:rPr>
           <w:rFonts w:hint="default" w:ascii="Times New Roman" w:hAnsi="Times New Roman"/>
           <w:bCs w:val="0"/>
-          <w:i/>
           <w:sz w:val="28"/>
           <w:szCs w:val="28"/>
           <w:lang w:val="en-US"/>
         </w:rPr>
-        <w:t>{name}</w:t>
+        <w:t>name}</w:t>
       </w:r>
       <w:r>
         <w:rPr>
           <w:rFonts w:ascii="Times New Roman" w:hAnsi="Times New Roman"/>
-          <w:i/>
           <w:sz w:val="28"/>
           <w:szCs w:val="28"/>
           <w:lang w:val="pt-BR"/>
@@ -769,7 +757,7 @@
           <w:spacing w:val="-4"/>
           <w:lang w:val="nl-NL"/>
         </w:rPr>
-        <w:t>Tư vấn lập Báo cáo kinh tế kỹ thuật</w:t>
+        <w:t>Tư vấn lập BCKTKT</w:t>
       </w:r>
       <w:r>
         <w:rPr>
@@ -788,7 +776,7 @@
           <w:spacing w:val="-4"/>
           <w:lang w:val="nl-NL"/>
         </w:rPr>
-        <w:t>Thẩm tra báo cáo kinh tế kỹ thuật</w:t>
+        <w:t>Tư vấn Thẩm tra BCKTKT</w:t>
       </w:r>
       <w:r>
         <w:rPr>
@@ -811,11 +799,9 @@
       <w:bookmarkStart w:id="0" w:name="_Hlk166070280"/>
       <w:r>
         <w:rPr>
-          <w:rFonts w:hint="default" w:ascii="Times New Roman" w:hAnsi="Times New Roman"/>
-          <w:bCs w:val="0"/>
+          <w:rFonts w:hint="default"/>
           <w:i/>
-          <w:sz w:val="28"/>
-          <w:szCs w:val="28"/>
+          <w:highlight w:val="yellow"/>
           <w:lang w:val="en-US"/>
         </w:rPr>
         <w:t>{name}</w:t>
@@ -920,8 +906,8 @@
         <w:rPr>
           <w:rFonts w:hint="default"/>
           <w:i/>
-          <w:iCs/>
           <w:spacing w:val="-6"/>
+          <w:highlight w:val="yellow"/>
           <w:lang w:val="en-US"/>
         </w:rPr>
         <w:t>{name}</w:t>
@@ -956,9 +942,6 @@
         <w:spacing w:before="120"/>
         <w:ind w:firstLine="720"/>
         <w:jc w:val="both"/>
-        <w:rPr>
-          <w:highlight w:val="none"/>
-        </w:rPr>
       </w:pPr>
       <w:r>
         <w:t xml:space="preserve">- Chi phí sửa chữa (dự kiến): </w:t>
@@ -968,14 +951,16 @@
           <w:rFonts w:hint="default"/>
           <w:b/>
           <w:bCs/>
+          <w:highlight w:val="yellow"/>
           <w:lang w:val="en-US"/>
         </w:rPr>
-        <w:t>{cost}</w:t>
-      </w:r>
-      <w:r>
-        <w:rPr>
-          <w:rFonts w:hint="default"/>
-          <w:lang w:val="en-US"/>
+        <w:t>{est_cost}</w:t>
+      </w:r>
+      <w:r>
+        <w:rPr>
+          <w:b/>
+          <w:bCs/>
+          <w:highlight w:val="yellow"/>
         </w:rPr>
         <w:t xml:space="preserve"> </w:t>
       </w:r>
@@ -984,7 +969,7 @@
           <w:b/>
           <w:bCs/>
           <w:spacing w:val="-8"/>
-          <w:highlight w:val="none"/>
+          <w:highlight w:val="yellow"/>
           <w:lang w:val="nl-NL"/>
         </w:rPr>
         <w:t>đồng</w:t>
@@ -992,7 +977,7 @@
       <w:r>
         <w:rPr>
           <w:spacing w:val="-8"/>
-          <w:highlight w:val="none"/>
+          <w:highlight w:val="yellow"/>
           <w:lang w:val="nl-NL"/>
         </w:rPr>
         <w:t xml:space="preserve"> </w:t>
@@ -1001,7 +986,7 @@
         <w:rPr>
           <w:i/>
           <w:spacing w:val="-8"/>
-          <w:highlight w:val="none"/>
+          <w:highlight w:val="yellow"/>
           <w:lang w:val="nl-NL"/>
         </w:rPr>
         <w:t xml:space="preserve">(Bằng chữ: </w:t>
@@ -1011,19 +996,19 @@
           <w:rFonts w:hint="default"/>
           <w:i/>
           <w:spacing w:val="-8"/>
-          <w:highlight w:val="none"/>
+          <w:highlight w:val="yellow"/>
           <w:lang w:val="en-US"/>
         </w:rPr>
-        <w:t xml:space="preserve">{costString} </w:t>
+        <w:t>{est_cost_str}</w:t>
       </w:r>
       <w:r>
         <w:rPr>
           <w:i/>
           <w:spacing w:val="-8"/>
-          <w:highlight w:val="none"/>
+          <w:highlight w:val="yellow"/>
           <w:lang w:val="nl-NL"/>
         </w:rPr>
-        <w:t>đồng./.);</w:t>
+        <w:t>/.);</w:t>
       </w:r>
     </w:p>
     <w:p>
@@ -1051,93 +1036,13 @@
       <w:r>
         <w:rPr>
           <w:rFonts w:hint="default"/>
+          <w:highlight w:val="yellow"/>
           <w:lang w:val="en-US"/>
         </w:rPr>
-        <w:t>{sourceOfFunds}</w:t>
-      </w:r>
-      <w:r>
-        <w:rPr>
-          <w:highlight w:val="none"/>
-        </w:rPr>
+        <w:t>{source_of_funds}</w:t>
+      </w:r>
+      <w:r>
         <w:t>;</w:t>
-      </w:r>
-    </w:p>
-    <w:p>
-      <w:pPr>
-        <w:widowControl w:val="0"/>
-        <w:spacing w:before="120"/>
-        <w:ind w:firstLine="720"/>
-        <w:jc w:val="both"/>
-        <w:rPr>
-          <w:rFonts w:hint="default"/>
-          <w:lang w:val="en-US"/>
-        </w:rPr>
-      </w:pPr>
-      <w:r>
-        <w:t xml:space="preserve">- </w:t>
-      </w:r>
-      <w:r>
-        <w:rPr>
-          <w:lang w:val="vi-VN"/>
-        </w:rPr>
-        <w:t>Thời gian thực hiện</w:t>
-      </w:r>
-      <w:r>
-        <w:t xml:space="preserve">: </w:t>
-      </w:r>
-      <w:r>
-        <w:rPr>
-          <w:rFonts w:hint="default"/>
-          <w:lang w:val="en-US"/>
-        </w:rPr>
-        <w:t>{constructionImplementationTime};</w:t>
-      </w:r>
-    </w:p>
-    <w:p>
-      <w:pPr>
-        <w:widowControl w:val="0"/>
-        <w:spacing w:before="120"/>
-        <w:ind w:right="282" w:firstLine="720"/>
-        <w:jc w:val="both"/>
-      </w:pPr>
-      <w:r>
-        <w:t>- Hiện trạng, nội dung sửa chữa:</w:t>
-      </w:r>
-    </w:p>
-    <w:p>
-      <w:pPr>
-        <w:widowControl w:val="0"/>
-        <w:spacing w:before="120"/>
-        <w:ind w:firstLine="720"/>
-        <w:jc w:val="both"/>
-        <w:rPr>
-          <w:rFonts w:hint="default"/>
-          <w:lang w:val="en-US"/>
-        </w:rPr>
-      </w:pPr>
-      <w:r>
-        <w:t xml:space="preserve">+ Hiện trạng công trình: </w:t>
-      </w:r>
-      <w:r>
-        <w:rPr>
-          <w:rFonts w:hint="default"/>
-          <w:lang w:val="en-US"/>
-        </w:rPr>
-        <w:t>{existingConditionOfTheStruct</w:t>
-      </w:r>
-      <w:r>
-        <w:rPr>
-          <w:rFonts w:hint="default"/>
-          <w:lang w:val="vi-VN"/>
-        </w:rPr>
-        <w:t>u</w:t>
-      </w:r>
-      <w:r>
-        <w:rPr>
-          <w:rFonts w:hint="default"/>
-          <w:lang w:val="en-US"/>
-        </w:rPr>
-        <w:t>re}</w:t>
       </w:r>
     </w:p>
     <w:p>
@@ -1148,20 +1053,33 @@
         <w:jc w:val="both"/>
       </w:pPr>
       <w:r>
-        <w:t xml:space="preserve">+ Nội dung sửa chữa: </w:t>
+        <w:t xml:space="preserve">- </w:t>
+      </w:r>
+      <w:r>
+        <w:rPr>
+          <w:lang w:val="vi-VN"/>
+        </w:rPr>
+        <w:t>Thời gian thực hiện</w:t>
+      </w:r>
+      <w:r>
+        <w:t xml:space="preserve">: </w:t>
+      </w:r>
+      <w:r>
+        <w:rPr>
+          <w:highlight w:val="yellow"/>
+        </w:rPr>
+        <w:t xml:space="preserve">Từ </w:t>
       </w:r>
       <w:r>
         <w:rPr>
           <w:rFonts w:hint="default"/>
+          <w:highlight w:val="yellow"/>
           <w:lang w:val="en-US"/>
         </w:rPr>
-        <w:t>{repairScope}</w:t>
-      </w:r>
-      <w:r>
-        <w:rPr>
-          <w:highlight w:val="none"/>
-        </w:rPr>
-        <w:t>.</w:t>
+        <w:t>{impl_duration}</w:t>
+      </w:r>
+      <w:r>
+        <w:t>;</w:t>
       </w:r>
     </w:p>
     <w:p>
@@ -1170,6 +1088,85 @@
         <w:spacing w:before="120"/>
         <w:ind w:firstLine="720"/>
         <w:jc w:val="both"/>
+      </w:pPr>
+      <w:r>
+        <w:t>- Hiện trạng và nội dung sửa chữa:</w:t>
+      </w:r>
+    </w:p>
+    <w:p>
+      <w:pPr>
+        <w:spacing w:before="120" w:line="360" w:lineRule="exact"/>
+        <w:ind w:firstLine="709"/>
+        <w:jc w:val="both"/>
+      </w:pPr>
+      <w:r>
+        <w:t xml:space="preserve">+ Hiện trạng công trình: </w:t>
+      </w:r>
+    </w:p>
+    <w:p>
+      <w:pPr>
+        <w:spacing w:before="120" w:line="360" w:lineRule="exact"/>
+        <w:ind w:firstLine="709"/>
+        <w:jc w:val="both"/>
+      </w:pPr>
+      <w:r>
+        <w:rPr>
+          <w:rFonts w:hint="default"/>
+          <w:bCs/>
+          <w:kern w:val="16"/>
+          <w:highlight w:val="yellow"/>
+          <w:lang w:val="en-US"/>
+        </w:rPr>
+        <w:t>{existing_condition_of_the_structure}</w:t>
+      </w:r>
+      <w:r>
+        <w:rPr>
+          <w:highlight w:val="yellow"/>
+        </w:rPr>
+        <w:t>.</w:t>
+      </w:r>
+    </w:p>
+    <w:p>
+      <w:pPr>
+        <w:spacing w:before="80" w:after="40"/>
+        <w:ind w:firstLine="709"/>
+        <w:jc w:val="both"/>
+        <w:rPr>
+          <w:b/>
+          <w:bCs/>
+        </w:rPr>
+      </w:pPr>
+      <w:r>
+        <w:t xml:space="preserve">+ Nội dung sửa chữa: </w:t>
+      </w:r>
+    </w:p>
+    <w:p>
+      <w:pPr>
+        <w:spacing w:before="80" w:after="40"/>
+        <w:ind w:firstLine="567"/>
+        <w:jc w:val="both"/>
+      </w:pPr>
+      <w:r>
+        <w:rPr>
+          <w:rFonts w:hint="default"/>
+          <w:highlight w:val="yellow"/>
+          <w:lang w:val="en-US"/>
+        </w:rPr>
+        <w:t>{repair_scope}</w:t>
+      </w:r>
+      <w:r>
+        <w:rPr>
+          <w:highlight w:val="yellow"/>
+        </w:rPr>
+        <w:t>.</w:t>
+      </w:r>
+    </w:p>
+    <w:p>
+      <w:pPr>
+        <w:widowControl w:val="0"/>
+        <w:spacing w:before="120"/>
+        <w:ind w:firstLine="720"/>
+        <w:jc w:val="both"/>
         <w:rPr>
           <w:b/>
           <w:iCs/>
@@ -1187,6 +1184,352 @@
           <w:lang w:val="nl-NL"/>
         </w:rPr>
         <w:t>II. Căn cứ pháp lý</w:t>
+      </w:r>
+    </w:p>
+    <w:p>
+      <w:pPr>
+        <w:spacing w:before="120"/>
+        <w:ind w:firstLine="709"/>
+        <w:jc w:val="both"/>
+        <w:rPr>
+          <w:iCs/>
+          <w:color w:val="000000"/>
+        </w:rPr>
+      </w:pPr>
+      <w:r>
+        <w:rPr>
+          <w:b/>
+          <w:bCs/>
+          <w:iCs/>
+          <w:spacing w:val="-2"/>
+          <w:lang w:val="nl-NL"/>
+        </w:rPr>
+        <w:t xml:space="preserve">Căn cứ </w:t>
+      </w:r>
+      <w:r>
+        <w:rPr>
+          <w:b/>
+          <w:iCs/>
+          <w:spacing w:val="-2"/>
+          <w:lang w:val="nl-NL"/>
+        </w:rPr>
+        <w:t xml:space="preserve">các luật: </w:t>
+      </w:r>
+      <w:r>
+        <w:rPr>
+          <w:iCs/>
+          <w:color w:val="000000"/>
+        </w:rPr>
+        <w:t xml:space="preserve">Luật Xây dựng số 50/2014/QH13 ngày 18 tháng 6 năm 2014; Luật Sửa đổi bổ sung một số điều của Luật Xây dựng số 62/2020/QH14 ngày 17 tháng 6 năm 2020; Luật Đấu thầu số 22/2023/QH15 được Quốc hội thông qua ngày 23/6/2023, </w:t>
+      </w:r>
+      <w:r>
+        <w:rPr>
+          <w:color w:val="000000"/>
+        </w:rPr>
+        <w:t>Luật số 57/2024/QH15 ngày 29/11/2024, Luật số 90/2025/QH15 ngày 25/6/2025</w:t>
+      </w:r>
+      <w:r>
+        <w:rPr>
+          <w:iCs/>
+          <w:color w:val="000000"/>
+        </w:rPr>
+        <w:t>;</w:t>
+      </w:r>
+    </w:p>
+    <w:p>
+      <w:pPr>
+        <w:spacing w:before="120"/>
+        <w:ind w:firstLine="709"/>
+        <w:jc w:val="both"/>
+        <w:rPr>
+          <w:iCs/>
+          <w:color w:val="000000"/>
+        </w:rPr>
+      </w:pPr>
+      <w:r>
+        <w:rPr>
+          <w:iCs/>
+          <w:color w:val="000000"/>
+        </w:rPr>
+        <w:t>Căn cứ các Nghị định của Chính phủ: số </w:t>
+      </w:r>
+      <w:r>
+        <w:rPr>
+          <w:iCs/>
+          <w:color w:val="000000"/>
+        </w:rPr>
+        <w:fldChar w:fldCharType="begin"/>
+      </w:r>
+      <w:r>
+        <w:rPr>
+          <w:iCs/>
+          <w:color w:val="000000"/>
+        </w:rPr>
+        <w:instrText xml:space="preserve"> HYPERLINK "https://thuvienphapluat.vn/phap-luat/tim-van-ban.aspx?keyword=37/2015/N%C4%90-CP&amp;area=2&amp;type=0&amp;match=False&amp;vc=True&amp;lan=1" \t "_blank" </w:instrText>
+      </w:r>
+      <w:r>
+        <w:rPr>
+          <w:iCs/>
+          <w:color w:val="000000"/>
+        </w:rPr>
+        <w:fldChar w:fldCharType="separate"/>
+      </w:r>
+      <w:r>
+        <w:rPr>
+          <w:iCs/>
+          <w:color w:val="000000"/>
+        </w:rPr>
+        <w:t>37/2015/NĐ-CP</w:t>
+      </w:r>
+      <w:r>
+        <w:rPr>
+          <w:iCs/>
+          <w:color w:val="000000"/>
+        </w:rPr>
+        <w:fldChar w:fldCharType="end"/>
+      </w:r>
+      <w:r>
+        <w:rPr>
+          <w:iCs/>
+          <w:color w:val="000000"/>
+        </w:rPr>
+        <w:t xml:space="preserve"> ngày 22/4/2015 quy định chi tiết về hợp đồng xây dựng; </w:t>
+      </w:r>
+      <w:r>
+        <w:rPr>
+          <w:iCs/>
+          <w:color w:val="000000"/>
+        </w:rPr>
+        <w:fldChar w:fldCharType="begin"/>
+      </w:r>
+      <w:r>
+        <w:rPr>
+          <w:iCs/>
+          <w:color w:val="000000"/>
+        </w:rPr>
+        <w:instrText xml:space="preserve"> HYPERLINK "https://thuvienphapluat.vn/van-ban/Xay-dung-Do-thi/Nghi-dinh-50-2021-ND-CP-sua-doi-Nghi-dinh-37-2015-ND-CP-huong-dan-hop-dong-xay-dung-393920.aspx" </w:instrText>
+      </w:r>
+      <w:r>
+        <w:rPr>
+          <w:iCs/>
+          <w:color w:val="000000"/>
+        </w:rPr>
+        <w:fldChar w:fldCharType="separate"/>
+      </w:r>
+      <w:r>
+        <w:rPr>
+          <w:color w:val="000000"/>
+        </w:rPr>
+        <w:t>số 50/2021/NĐ-CP ngày 01/4/2021 sửa đổi, bổ sung một số điều của Nghị định số 37/2015/NĐ-CP ngày 22/4/2015</w:t>
+      </w:r>
+      <w:r>
+        <w:rPr>
+          <w:iCs/>
+          <w:color w:val="000000"/>
+        </w:rPr>
+        <w:fldChar w:fldCharType="end"/>
+      </w:r>
+      <w:r>
+        <w:rPr>
+          <w:iCs/>
+          <w:color w:val="000000"/>
+        </w:rPr>
+        <w:t xml:space="preserve">; </w:t>
+      </w:r>
+      <w:r>
+        <w:rPr>
+          <w:bCs/>
+          <w:color w:val="000000"/>
+        </w:rPr>
+        <w:t>số 175/2024/NĐ-CP ngày 30/12/2024 Quy định chi tiết một số điều và biện pháp thi hành Luật Xây dựng về quản lý hoạt động xây dựng;</w:t>
+      </w:r>
+      <w:r>
+        <w:rPr>
+          <w:iCs/>
+          <w:color w:val="000000"/>
+        </w:rPr>
+        <w:t xml:space="preserve"> </w:t>
+      </w:r>
+      <w:r>
+        <w:rPr>
+          <w:color w:val="081B3A"/>
+          <w:spacing w:val="3"/>
+          <w:shd w:val="clear" w:color="auto" w:fill="FFFFFF"/>
+        </w:rPr>
+        <w:t>Nghị định 17/2025/NĐ-CP sửa đổi, bổ sung các Nghị định hướng dẫn Luật Đấu thầu;</w:t>
+      </w:r>
+      <w:r>
+        <w:rPr>
+          <w:rFonts w:ascii="Segoe UI" w:hAnsi="Segoe UI" w:cs="Segoe UI"/>
+          <w:color w:val="081B3A"/>
+          <w:spacing w:val="3"/>
+          <w:sz w:val="23"/>
+          <w:szCs w:val="23"/>
+          <w:shd w:val="clear" w:color="auto" w:fill="FFFFFF"/>
+        </w:rPr>
+        <w:t xml:space="preserve"> </w:t>
+      </w:r>
+      <w:r>
+        <w:rPr>
+          <w:iCs/>
+          <w:color w:val="000000"/>
+        </w:rPr>
+        <w:t xml:space="preserve">Số </w:t>
+      </w:r>
+      <w:r>
+        <w:rPr>
+          <w:color w:val="000000"/>
+        </w:rPr>
+        <w:t>214/2025/NĐ-CP ngày 04/08/2025 quy định chi tiết một số điều và biện pháp thi hành Luật Đấu thầu 2023 về lựa chọn nhà thầu</w:t>
+      </w:r>
+      <w:r>
+        <w:rPr>
+          <w:iCs/>
+          <w:color w:val="000000"/>
+        </w:rPr>
+        <w:t>;</w:t>
+      </w:r>
+    </w:p>
+    <w:p>
+      <w:pPr>
+        <w:spacing w:before="120"/>
+        <w:ind w:firstLine="709"/>
+        <w:jc w:val="both"/>
+        <w:rPr>
+          <w:iCs/>
+          <w:color w:val="000000"/>
+          <w:spacing w:val="-2"/>
+          <w:lang w:val="nl-NL"/>
+        </w:rPr>
+      </w:pPr>
+      <w:r>
+        <w:rPr>
+          <w:iCs/>
+          <w:color w:val="000000"/>
+          <w:spacing w:val="-2"/>
+          <w:lang w:val="nl-NL"/>
+        </w:rPr>
+        <w:t xml:space="preserve">Căn cứ các Thông tư: </w:t>
+      </w:r>
+      <w:r>
+        <w:rPr>
+          <w:color w:val="000000"/>
+          <w:lang w:val="nl-NL"/>
+        </w:rPr>
+        <w:t xml:space="preserve">Số 11/2021/TT-BXD ngày 31/8/2021 của Bộ Xây dựng về việc hướng dẫn một số nội dung xác định và quản lý chi phí đầu tư xây dựng; số 12/2021/TT-BXD ngày 31/8/2021 của Bộ Xây dựng về việc ban hành định mức xây dựng; </w:t>
+      </w:r>
+      <w:r>
+        <w:rPr>
+          <w:color w:val="000000"/>
+          <w:lang w:val="pt-BR"/>
+        </w:rPr>
+        <w:t>số 02/2023/TT-BXD ngày 03/3/2023 của Bộ Xây dựng về việc hướng dẫn một số nội dung của hợp đồng xây dựng</w:t>
+      </w:r>
+      <w:bookmarkStart w:id="1" w:name="_Hlk118786140"/>
+      <w:r>
+        <w:rPr>
+          <w:color w:val="000000"/>
+          <w:lang w:val="pt-BR"/>
+        </w:rPr>
+        <w:t xml:space="preserve">; </w:t>
+      </w:r>
+      <w:bookmarkEnd w:id="1"/>
+    </w:p>
+    <w:p>
+      <w:pPr>
+        <w:pStyle w:val="15"/>
+        <w:ind w:firstLine="840"/>
+        <w:rPr>
+          <w:b w:val="0"/>
+          <w:iCs/>
+          <w:color w:val="auto"/>
+          <w:spacing w:val="-2"/>
+          <w:lang w:val="nl-NL"/>
+        </w:rPr>
+      </w:pPr>
+      <w:r>
+        <w:rPr>
+          <w:b w:val="0"/>
+          <w:iCs/>
+          <w:color w:val="auto"/>
+          <w:spacing w:val="-2"/>
+          <w:lang w:val="nl-NL"/>
+        </w:rPr>
+        <w:t xml:space="preserve">Căn cứ Kế hoạch sản xuất kinh doanh – xây dựng đơn vị năm </w:t>
+      </w:r>
+      <w:r>
+        <w:rPr>
+          <w:rFonts w:hint="default"/>
+          <w:b w:val="0"/>
+          <w:iCs/>
+          <w:color w:val="auto"/>
+          <w:spacing w:val="-2"/>
+          <w:highlight w:val="yellow"/>
+          <w:lang w:val="en-US"/>
+        </w:rPr>
+        <w:t>{source_of_funds}</w:t>
+      </w:r>
+      <w:r>
+        <w:rPr>
+          <w:rFonts w:hint="default"/>
+          <w:b w:val="0"/>
+          <w:iCs/>
+          <w:color w:val="auto"/>
+          <w:spacing w:val="-2"/>
+          <w:highlight w:val="none"/>
+          <w:lang w:val="en-US"/>
+        </w:rPr>
+        <w:t xml:space="preserve"> </w:t>
+      </w:r>
+      <w:r>
+        <w:rPr>
+          <w:b w:val="0"/>
+          <w:iCs/>
+          <w:color w:val="auto"/>
+          <w:spacing w:val="-2"/>
+          <w:lang w:val="nl-NL"/>
+        </w:rPr>
+        <w:t xml:space="preserve">của Công ty Trực thăng Miền Nam đã được Tổng Giám đốc Tổng Công ty Trực thăng Việt Nam phê duyệt tại Quyết định số </w:t>
+      </w:r>
+      <w:r>
+        <w:rPr>
+          <w:rFonts w:hint="default"/>
+          <w:b w:val="0"/>
+          <w:iCs/>
+          <w:color w:val="auto"/>
+          <w:spacing w:val="-2"/>
+          <w:highlight w:val="yellow"/>
+          <w:lang w:val="en-US"/>
+        </w:rPr>
+        <w:t>{tct_pursuanted_dec_no}</w:t>
+      </w:r>
+      <w:r>
+        <w:rPr>
+          <w:b w:val="0"/>
+          <w:iCs/>
+          <w:color w:val="auto"/>
+          <w:spacing w:val="-2"/>
+          <w:highlight w:val="yellow"/>
+          <w:lang w:val="nl-NL"/>
+        </w:rPr>
+        <w:t>.</w:t>
+      </w:r>
+    </w:p>
+    <w:p>
+      <w:pPr>
+        <w:pStyle w:val="15"/>
+        <w:ind w:firstLine="840"/>
+        <w:rPr>
+          <w:color w:val="000000"/>
+          <w:lang w:val="nl-NL"/>
+        </w:rPr>
+      </w:pPr>
+      <w:r>
+        <w:rPr>
+          <w:color w:val="000000"/>
+          <w:lang w:val="nl-NL"/>
+        </w:rPr>
+        <w:t xml:space="preserve">III. Phần Kế hoạch LCNT </w:t>
       </w:r>
     </w:p>
     <w:p>
@@ -1196,189 +1539,13 @@
         <w:jc w:val="both"/>
         <w:rPr>
           <w:rFonts w:eastAsia="Times New Roman"/>
+          <w:b/>
           <w:bCs/>
-          <w:iCs/>
-          <w:color w:val="000000"/>
-        </w:rPr>
-      </w:pPr>
-      <w:bookmarkStart w:id="1" w:name="_Hlk207198037"/>
-      <w:r>
-        <w:rPr>
-          <w:rFonts w:eastAsia="Times New Roman"/>
-          <w:bCs/>
-          <w:iCs/>
-          <w:color w:val="000000"/>
-        </w:rPr>
-        <w:t>Căn cứ Luật Xây dựng số 50/2014/QH13 ngày 18/6/2014 được sửa đổi, bổ sung một số điều tại Luật số 03/2016/QH14, Luật số 35/2018/QH14, Luật số 40/2019/QH14, Luật số 62/2020/QH14 ngày 17/6/2020; Luật Đấu thầu số 22/2023/QH15 ngày 23/6/2023; Luật số 57/2024/QH15 ngày 29/11/2024; Luật số 90/2025/QH15 ngày 25/6/2025;</w:t>
-      </w:r>
-    </w:p>
-    <w:p>
-      <w:pPr>
-        <w:spacing w:before="120"/>
-        <w:ind w:firstLine="720"/>
-        <w:jc w:val="both"/>
-        <w:rPr>
-          <w:rFonts w:eastAsia="Times New Roman"/>
-          <w:bCs/>
-          <w:iCs/>
-          <w:color w:val="000000"/>
-        </w:rPr>
-      </w:pPr>
-      <w:r>
-        <w:rPr>
-          <w:rFonts w:eastAsia="Times New Roman"/>
-          <w:bCs/>
-          <w:iCs/>
-          <w:color w:val="000000"/>
-        </w:rPr>
-        <w:t xml:space="preserve">Căn cứ các Nghị định của Chính phủ: số 214/2025/NĐ-CP ngày 04/8/2025 của Chính phủ quy định chi tiết một số điều và biện pháp thi hành Luật Đấu thầu về lựa chọn nhà thầu; số 10/2021/NĐ-CP ngày 09/02/2021 về quản lý chi phi đầu tư xây dựng; số 06/2021/NĐ-CP ngày 26/01/2021 quy định chi tiết một số nội dung về quản lý chất lượng công trình xây dựng, thi công xây dựng công trình và bảo trì công trình xây dựng; số 35/2023/NĐ-CP ngày 20/6/2023 sửa đổi, bổ sung một số điều của các Nghị định thuộc lĩnh vực quản lý nhà nước của Bộ Xây dựng; số 175/2024/NĐ-CP ngày 30/12/2024 quy định chi tiết một số điều và biện pháp thi hành Luật Xây dựng về quản lý hoạt động xây dựng; </w:t>
-      </w:r>
-      <w:bookmarkEnd w:id="1"/>
-    </w:p>
-    <w:p>
-      <w:pPr>
-        <w:spacing w:before="120"/>
-        <w:ind w:firstLine="720"/>
-        <w:jc w:val="both"/>
-        <w:rPr>
-          <w:rFonts w:eastAsia="Times New Roman"/>
-          <w:bCs/>
-          <w:iCs/>
-          <w:color w:val="000000"/>
-        </w:rPr>
-      </w:pPr>
-      <w:r>
-        <w:rPr>
-          <w:rFonts w:eastAsia="Times New Roman"/>
-          <w:bCs/>
-          <w:iCs/>
-          <w:color w:val="000000"/>
-        </w:rPr>
-        <w:t xml:space="preserve">Căn cứ các Thông tư: Số 79/2025/TT-BTC ngày 04/8/2025 </w:t>
-      </w:r>
-      <w:r>
-        <w:rPr>
-          <w:rFonts w:eastAsia="Times New Roman"/>
-          <w:bCs/>
-          <w:iCs/>
           <w:color w:val="000000"/>
           <w:lang w:val="nl-NL"/>
         </w:rPr>
-        <w:t>của Bộ Tài chính hướng dẫn về cung cấp, đăng tải thông tin về đấu thầu và mẫu hồ sơ về đấu thầu trên hệ thống mạng đấu thầu quốc gia;</w:t>
-      </w:r>
-      <w:r>
-        <w:rPr>
-          <w:rFonts w:eastAsia="Times New Roman"/>
-          <w:bCs/>
-          <w:iCs/>
-          <w:color w:val="000000"/>
-        </w:rPr>
-        <w:t xml:space="preserve"> số 11/2021/TT-BXD ngày 31/8/2021 của Bộ Xây dựng hướng dẫn xác định và quản lý chi phí đầu tư xây dựng; số 12/2021/TT- BXD ngày 31/8/2021 của Bộ Xây dựng về việc ban hành định mức xây dựng; số 174/2021/TT-BQP ngày 27/12/2021 được sửa đổi, bổ sung một số điều tại Thông tư số 24/2025 ngày 06/5/2025 của Bộ Quốc phòng quy định chi tiết và hướng dẫn thi hành một số nội dung tại Nghị định số 06/2021/NĐ-CP ngày 26/01/2021 quy định chi tiết một số nội dung về quản lý chất lượng công trình xây dựng, thi công xây dựng công trình và bảo trì công trình xây dựng; </w:t>
-      </w:r>
-    </w:p>
-    <w:p>
-      <w:pPr>
-        <w:spacing w:before="120"/>
-        <w:ind w:firstLine="720"/>
-        <w:jc w:val="both"/>
-        <w:rPr>
-          <w:rFonts w:hint="default" w:eastAsia="Times New Roman"/>
-          <w:bCs/>
-          <w:color w:val="000000"/>
-          <w:lang w:val="en-US"/>
-        </w:rPr>
       </w:pPr>
       <w:r>
-        <w:rPr>
-          <w:rFonts w:eastAsia="Times New Roman"/>
-          <w:bCs/>
-          <w:iCs/>
-          <w:color w:val="000000"/>
-          <w:lang w:val="nl-NL"/>
-        </w:rPr>
-        <w:t xml:space="preserve">Căn cứ Kế hoạch sản xuất kinh doanh – xây dựng đơn vị năm 2025 của Công ty Trực thăng Miền Nam đã được Tổng Giám đốc Tổng Công ty Trực thăng Việt Nam phê duyệt tại Quyết định số </w:t>
-      </w:r>
-      <w:r>
-        <w:rPr>
-          <w:rFonts w:hint="default" w:eastAsia="Times New Roman"/>
-          <w:bCs/>
-          <w:iCs/>
-          <w:color w:val="000000"/>
-          <w:lang w:val="en-US"/>
-        </w:rPr>
-        <w:t>{pursuantToDec_TCT.no}</w:t>
-      </w:r>
-      <w:r>
-        <w:rPr>
-          <w:rFonts w:eastAsia="Times New Roman"/>
-          <w:bCs/>
-          <w:iCs/>
-          <w:color w:val="000000"/>
-          <w:highlight w:val="none"/>
-          <w:lang w:val="nl-NL"/>
-        </w:rPr>
-        <w:t xml:space="preserve"> ngày </w:t>
-      </w:r>
-      <w:r>
-        <w:rPr>
-          <w:rFonts w:hint="default" w:eastAsia="Times New Roman"/>
-          <w:bCs/>
-          <w:iCs/>
-          <w:color w:val="000000"/>
-          <w:highlight w:val="none"/>
-          <w:lang w:val="en-US"/>
-        </w:rPr>
-        <w:t>{</w:t>
-      </w:r>
-      <w:r>
-        <w:rPr>
-          <w:rFonts w:hint="default" w:eastAsia="Times New Roman"/>
-          <w:bCs/>
-          <w:iCs/>
-          <w:color w:val="000000"/>
-          <w:lang w:val="en-US"/>
-        </w:rPr>
-        <w:t>pursuantToDec_TCT</w:t>
-      </w:r>
-      <w:r>
-        <w:rPr>
-          <w:rFonts w:hint="default" w:eastAsia="Times New Roman"/>
-          <w:bCs/>
-          <w:iCs/>
-          <w:color w:val="000000"/>
-          <w:highlight w:val="none"/>
-          <w:lang w:val="en-US"/>
-        </w:rPr>
-        <w:t>.date}.</w:t>
-      </w:r>
-    </w:p>
-    <w:p>
-      <w:pPr>
-        <w:spacing w:before="120"/>
-        <w:ind w:firstLine="720"/>
-        <w:jc w:val="both"/>
-        <w:rPr>
-          <w:rFonts w:eastAsia="Times New Roman"/>
-          <w:b/>
-          <w:color w:val="000000"/>
-          <w:lang w:val="nl-NL"/>
-        </w:rPr>
-      </w:pPr>
-      <w:r>
-        <w:rPr>
-          <w:rFonts w:eastAsia="Times New Roman"/>
-          <w:b/>
-          <w:color w:val="000000"/>
-          <w:lang w:val="nl-NL"/>
-        </w:rPr>
-        <w:t xml:space="preserve">III. Phần Kế hoạch LCNT </w:t>
-      </w:r>
-    </w:p>
-    <w:p>
-      <w:pPr>
-        <w:spacing w:before="120"/>
-        <w:ind w:firstLine="720"/>
-        <w:jc w:val="both"/>
         <w:rPr>
           <w:rFonts w:eastAsia="Times New Roman"/>
           <w:b/>
@@ -1386,15 +1553,6 @@
           <w:color w:val="000000"/>
           <w:lang w:val="nl-NL"/>
         </w:rPr>
-      </w:pPr>
-      <w:r>
-        <w:rPr>
-          <w:rFonts w:eastAsia="Times New Roman"/>
-          <w:b/>
-          <w:bCs/>
-          <w:color w:val="000000"/>
-          <w:lang w:val="nl-NL"/>
-        </w:rPr>
         <w:t>1. Bảng tổng hợp phần công việc thuộc Kế hoạch lựa chọn nhà thầu</w:t>
       </w:r>
     </w:p>
@@ -1402,7 +1560,7 @@
       <w:tblPr>
         <w:tblStyle w:val="5"/>
         <w:tblpPr w:leftFromText="180" w:rightFromText="180" w:vertAnchor="text" w:horzAnchor="margin" w:tblpXSpec="center" w:tblpY="256"/>
-        <w:tblW w:w="9274" w:type="dxa"/>
+        <w:tblW w:w="9128" w:type="dxa"/>
         <w:tblInd w:w="-5" w:type="dxa"/>
         <w:tblBorders>
           <w:top w:val="single" w:color="auto" w:sz="4" w:space="0"/>
@@ -1425,7 +1583,7 @@
         <w:gridCol w:w="711"/>
         <w:gridCol w:w="840"/>
         <w:gridCol w:w="1265"/>
-        <w:gridCol w:w="1295"/>
+        <w:gridCol w:w="1149"/>
         <w:gridCol w:w="700"/>
         <w:gridCol w:w="951"/>
         <w:gridCol w:w="1120"/>
@@ -1662,7 +1820,7 @@
         </w:tc>
         <w:tc>
           <w:tcPr>
-            <w:tcW w:w="1295" w:type="dxa"/>
+            <w:tcW w:w="1149" w:type="dxa"/>
             <w:vMerge w:val="restart"/>
             <w:tcBorders>
               <w:top w:val="single" w:color="auto" w:sz="4" w:space="0"/>
@@ -2319,7 +2477,7 @@
         </w:tc>
         <w:tc>
           <w:tcPr>
-            <w:tcW w:w="1295" w:type="dxa"/>
+            <w:tcW w:w="1149" w:type="dxa"/>
             <w:vMerge w:val="continue"/>
             <w:tcBorders>
               <w:top w:val="single" w:color="auto" w:sz="4" w:space="0"/>
@@ -2564,9 +2722,36 @@
                 <w:rFonts w:hint="default" w:eastAsia="Times New Roman" w:cs="Times New Roman"/>
                 <w:sz w:val="20"/>
                 <w:szCs w:val="20"/>
+                <w:lang w:val="vi-VN"/>
+              </w:rPr>
+              <w:t>{#bi</w:t>
+            </w:r>
+            <w:r>
+              <w:rPr>
+                <w:rFonts w:hint="default" w:eastAsia="Times New Roman" w:cs="Times New Roman"/>
+                <w:sz w:val="20"/>
+                <w:szCs w:val="20"/>
                 <w:lang w:val="en-US"/>
               </w:rPr>
-              <w:t>{#bidPackages}{$index+1}</w:t>
+              <w:t>d_packages</w:t>
+            </w:r>
+            <w:r>
+              <w:rPr>
+                <w:rFonts w:hint="default" w:eastAsia="Times New Roman" w:cs="Times New Roman"/>
+                <w:sz w:val="20"/>
+                <w:szCs w:val="20"/>
+                <w:lang w:val="vi-VN"/>
+              </w:rPr>
+              <w:t>}</w:t>
+            </w:r>
+            <w:r>
+              <w:rPr>
+                <w:rFonts w:hint="default" w:eastAsia="Times New Roman" w:cs="Times New Roman"/>
+                <w:sz w:val="20"/>
+                <w:szCs w:val="20"/>
+                <w:lang w:val="en-US"/>
+              </w:rPr>
+              <w:t>{$index+1}</w:t>
             </w:r>
           </w:p>
         </w:tc>
@@ -2605,9 +2790,20 @@
                 <w:bCs/>
                 <w:sz w:val="20"/>
                 <w:szCs w:val="20"/>
+                <w:highlight w:val="yellow"/>
                 <w:lang w:val="en-US"/>
               </w:rPr>
-              <w:t>{projectOwner}</w:t>
+              <w:t>{</w:t>
+            </w:r>
+            <w:r>
+              <w:rPr>
+                <w:rFonts w:hint="default" w:eastAsia="Times New Roman" w:cs="Times New Roman"/>
+                <w:bCs/>
+                <w:sz w:val="20"/>
+                <w:szCs w:val="20"/>
+                <w:lang w:val="en-US"/>
+              </w:rPr>
+              <w:t>project_owner}</w:t>
             </w:r>
           </w:p>
         </w:tc>
@@ -2645,9 +2841,20 @@
                 <w:bCs/>
                 <w:sz w:val="20"/>
                 <w:szCs w:val="20"/>
+                <w:highlight w:val="yellow"/>
                 <w:lang w:val="en-US"/>
               </w:rPr>
-              <w:t>{bidPackageName}</w:t>
+              <w:t>{</w:t>
+            </w:r>
+            <w:r>
+              <w:rPr>
+                <w:rFonts w:hint="default" w:eastAsia="Times New Roman" w:cs="Times New Roman"/>
+                <w:bCs/>
+                <w:sz w:val="20"/>
+                <w:szCs w:val="20"/>
+                <w:lang w:val="en-US"/>
+              </w:rPr>
+              <w:t>name}</w:t>
             </w:r>
           </w:p>
         </w:tc>
@@ -2682,18 +2889,27 @@
             <w:r>
               <w:rPr>
                 <w:rFonts w:hint="default" w:eastAsia="Times New Roman" w:cs="Times New Roman"/>
-                <w:bCs/>
-                <w:sz w:val="20"/>
-                <w:szCs w:val="20"/>
+                <w:sz w:val="20"/>
+                <w:szCs w:val="20"/>
+                <w:highlight w:val="yellow"/>
                 <w:lang w:val="en-US"/>
               </w:rPr>
-              <w:t>{shortDescription}</w:t>
+              <w:t>{</w:t>
+            </w:r>
+            <w:r>
+              <w:rPr>
+                <w:rFonts w:hint="default" w:eastAsia="Times New Roman" w:cs="Times New Roman"/>
+                <w:sz w:val="20"/>
+                <w:szCs w:val="20"/>
+                <w:lang w:val="en-US"/>
+              </w:rPr>
+              <w:t>short_desc}</w:t>
             </w:r>
           </w:p>
         </w:tc>
         <w:tc>
           <w:tcPr>
-            <w:tcW w:w="1295" w:type="dxa"/>
+            <w:tcW w:w="1149" w:type="dxa"/>
             <w:tcBorders>
               <w:top w:val="single" w:color="auto" w:sz="4" w:space="0"/>
               <w:left w:val="single" w:color="auto" w:sz="4" w:space="0"/>
@@ -2710,8 +2926,8 @@
               <w:widowControl/>
               <w:suppressLineNumbers w:val="0"/>
               <w:spacing w:before="0" w:beforeAutospacing="0" w:after="0" w:afterAutospacing="0"/>
-              <w:ind w:left="0" w:right="57"/>
-              <w:jc w:val="right"/>
+              <w:ind w:left="0" w:right="0"/>
+              <w:jc w:val="center"/>
               <w:rPr>
                 <w:rFonts w:hint="default" w:ascii="Times New Roman" w:hAnsi="Times New Roman" w:eastAsia="Times New Roman" w:cs="Times New Roman"/>
                 <w:bCs/>
@@ -2727,9 +2943,10 @@
                 <w:bCs/>
                 <w:sz w:val="20"/>
                 <w:szCs w:val="20"/>
+                <w:highlight w:val="yellow"/>
                 <w:lang w:val="en-US"/>
               </w:rPr>
-              <w:t>{cost}</w:t>
+              <w:t>{est_cost}</w:t>
             </w:r>
           </w:p>
         </w:tc>
@@ -2759,6 +2976,7 @@
                 <w:bCs/>
                 <w:sz w:val="20"/>
                 <w:szCs w:val="20"/>
+                <w:highlight w:val="yellow"/>
                 <w:lang w:val="en-US"/>
               </w:rPr>
             </w:pPr>
@@ -2775,9 +2993,19 @@
                 <w:rFonts w:hint="default" w:eastAsia="Times New Roman" w:cs="Times New Roman"/>
                 <w:sz w:val="20"/>
                 <w:szCs w:val="20"/>
+                <w:highlight w:val="yellow"/>
                 <w:lang w:val="en-US"/>
               </w:rPr>
-              <w:t>{sourceOfFunds}</w:t>
+              <w:t>{source_of_funds</w:t>
+            </w:r>
+            <w:r>
+              <w:rPr>
+                <w:rFonts w:hint="default" w:eastAsia="Times New Roman" w:cs="Times New Roman"/>
+                <w:sz w:val="20"/>
+                <w:szCs w:val="20"/>
+                <w:lang w:val="en-US"/>
+              </w:rPr>
+              <w:t>}</w:t>
             </w:r>
           </w:p>
         </w:tc>
@@ -2803,32 +3031,6 @@
               <w:ind w:left="0" w:right="0"/>
               <w:jc w:val="center"/>
               <w:rPr>
-                <w:rFonts w:hint="default" w:eastAsia="Times New Roman"/>
-                <w:bCs/>
-                <w:sz w:val="20"/>
-                <w:szCs w:val="20"/>
-              </w:rPr>
-            </w:pPr>
-            <w:r>
-              <w:rPr>
-                <w:rFonts w:hint="default" w:eastAsia="Times New Roman"/>
-                <w:bCs/>
-                <w:sz w:val="20"/>
-                <w:szCs w:val="20"/>
-              </w:rPr>
-              <w:t>Chỉ định thầu</w:t>
-            </w:r>
-          </w:p>
-          <w:p>
-            <w:pPr>
-              <w:keepNext w:val="0"/>
-              <w:keepLines w:val="0"/>
-              <w:widowControl/>
-              <w:suppressLineNumbers w:val="0"/>
-              <w:spacing w:before="0" w:beforeAutospacing="0" w:after="0" w:afterAutospacing="0" w:line="240" w:lineRule="auto"/>
-              <w:ind w:left="0" w:right="0"/>
-              <w:jc w:val="center"/>
-              <w:rPr>
                 <w:rFonts w:hint="default" w:ascii="Times New Roman" w:hAnsi="Times New Roman" w:eastAsia="Times New Roman" w:cs="Times New Roman"/>
                 <w:bCs/>
                 <w:sz w:val="20"/>
@@ -2838,12 +3040,24 @@
             </w:pPr>
             <w:r>
               <w:rPr>
-                <w:rFonts w:hint="default" w:eastAsia="Times New Roman"/>
-                <w:bCs/>
-                <w:sz w:val="20"/>
-                <w:szCs w:val="20"/>
-              </w:rPr>
-              <w:t>rút gọn</w:t>
+                <w:rFonts w:hint="default" w:eastAsia="Times New Roman" w:cs="Times New Roman"/>
+                <w:bCs/>
+                <w:sz w:val="20"/>
+                <w:szCs w:val="20"/>
+                <w:highlight w:val="yellow"/>
+                <w:lang w:val="en-US"/>
+              </w:rPr>
+              <w:t>{</w:t>
+            </w:r>
+            <w:r>
+              <w:rPr>
+                <w:rFonts w:hint="default" w:eastAsia="Times New Roman" w:cs="Times New Roman"/>
+                <w:bCs/>
+                <w:sz w:val="20"/>
+                <w:szCs w:val="20"/>
+                <w:lang w:val="en-US"/>
+              </w:rPr>
+              <w:t>bidder_selection_method}</w:t>
             </w:r>
           </w:p>
         </w:tc>
@@ -2874,18 +3088,18 @@
                 <w:sz w:val="20"/>
                 <w:szCs w:val="20"/>
                 <w:highlight w:val="yellow"/>
+              </w:rPr>
+            </w:pPr>
+            <w:r>
+              <w:rPr>
+                <w:rFonts w:hint="default" w:eastAsia="Times New Roman" w:cs="Times New Roman"/>
+                <w:bCs/>
+                <w:sz w:val="20"/>
+                <w:szCs w:val="20"/>
+                <w:highlight w:val="yellow"/>
                 <w:lang w:val="en-US"/>
               </w:rPr>
-            </w:pPr>
-            <w:r>
-              <w:rPr>
-                <w:rFonts w:hint="default" w:eastAsia="Times New Roman" w:cs="Times New Roman"/>
-                <w:bCs/>
-                <w:sz w:val="20"/>
-                <w:szCs w:val="20"/>
-                <w:lang w:val="en-US"/>
-              </w:rPr>
-              <w:t>{bidderSelectionTime}</w:t>
+              <w:t>{bidder_selection_time}</w:t>
             </w:r>
           </w:p>
         </w:tc>
@@ -2921,16 +3135,14 @@
                 <w:bCs/>
                 <w:sz w:val="20"/>
                 <w:szCs w:val="20"/>
-                <w:lang w:val="vi-VN"/>
-              </w:rPr>
-            </w:pPr>
-            <w:r>
-              <w:rPr>
-                <w:rFonts w:hint="default" w:eastAsia="Times New Roman" w:cs="Times New Roman"/>
-                <w:bCs/>
-                <w:sz w:val="20"/>
-                <w:szCs w:val="20"/>
-                <w:lang w:val="vi-VN"/>
+              </w:rPr>
+            </w:pPr>
+            <w:r>
+              <w:rPr>
+                <w:rFonts w:hint="default" w:ascii="Times New Roman" w:hAnsi="Times New Roman" w:eastAsia="Times New Roman" w:cs="Times New Roman"/>
+                <w:bCs/>
+                <w:sz w:val="20"/>
+                <w:szCs w:val="20"/>
               </w:rPr>
               <w:t>Trọn gói</w:t>
             </w:r>
@@ -2960,27 +3172,83 @@
               <w:keepLines w:val="0"/>
               <w:widowControl/>
               <w:suppressLineNumbers w:val="0"/>
-              <w:spacing w:before="0" w:beforeAutospacing="0" w:after="0" w:afterAutospacing="0" w:line="480" w:lineRule="auto"/>
-              <w:ind w:left="0" w:right="0"/>
-              <w:jc w:val="center"/>
-              <w:rPr>
-                <w:rFonts w:hint="default" w:ascii="Times New Roman" w:hAnsi="Times New Roman" w:eastAsia="Times New Roman" w:cs="Times New Roman"/>
+              <w:spacing w:before="0" w:beforeAutospacing="0" w:after="0" w:afterAutospacing="0"/>
+              <w:ind w:left="0" w:right="0"/>
+              <w:jc w:val="center"/>
+              <w:rPr>
+                <w:rFonts w:hint="default" w:ascii="Times New Roman" w:hAnsi="Times New Roman" w:eastAsia="Times New Roman" w:cs="Times New Roman"/>
+                <w:bCs/>
+                <w:sz w:val="20"/>
+                <w:szCs w:val="20"/>
+                <w:highlight w:val="yellow"/>
+              </w:rPr>
+            </w:pPr>
+            <w:r>
+              <w:rPr>
+                <w:rFonts w:hint="default" w:eastAsia="Times New Roman" w:cs="Times New Roman"/>
                 <w:bCs/>
                 <w:sz w:val="20"/>
                 <w:szCs w:val="20"/>
                 <w:highlight w:val="yellow"/>
                 <w:lang w:val="en-US"/>
               </w:rPr>
-            </w:pPr>
+              <w:t>{duration}</w:t>
+            </w:r>
             <w:r>
               <w:rPr>
                 <w:rFonts w:hint="default" w:eastAsia="Times New Roman" w:cs="Times New Roman"/>
-                <w:bCs/>
+                <w:sz w:val="20"/>
+                <w:szCs w:val="20"/>
+                <w:lang w:val="vi-VN"/>
+              </w:rPr>
+              <w:t>{</w:t>
+            </w:r>
+            <w:r>
+              <w:rPr>
+                <w:rFonts w:hint="default" w:eastAsia="Times New Roman" w:cs="Times New Roman"/>
                 <w:sz w:val="20"/>
                 <w:szCs w:val="20"/>
                 <w:lang w:val="en-US"/>
               </w:rPr>
-              <w:t>{upTo}{/bidPackages}</w:t>
+              <w:t>/</w:t>
+            </w:r>
+            <w:r>
+              <w:rPr>
+                <w:rFonts w:hint="default" w:eastAsia="Times New Roman" w:cs="Times New Roman"/>
+                <w:sz w:val="20"/>
+                <w:szCs w:val="20"/>
+                <w:lang w:val="vi-VN"/>
+              </w:rPr>
+              <w:t>bi</w:t>
+            </w:r>
+            <w:r>
+              <w:rPr>
+                <w:rFonts w:hint="default" w:eastAsia="Times New Roman" w:cs="Times New Roman"/>
+                <w:sz w:val="20"/>
+                <w:szCs w:val="20"/>
+                <w:lang w:val="en-US"/>
+              </w:rPr>
+              <w:t>d_p</w:t>
+            </w:r>
+            <w:bookmarkStart w:id="3" w:name="_GoBack"/>
+            <w:bookmarkEnd w:id="3"/>
+            <w:r>
+              <w:rPr>
+                <w:rFonts w:hint="default" w:eastAsia="Times New Roman" w:cs="Times New Roman"/>
+                <w:sz w:val="20"/>
+                <w:szCs w:val="20"/>
+                <w:lang w:val="en-US"/>
+              </w:rPr>
+              <w:t>ackages</w:t>
+            </w:r>
+            <w:r>
+              <w:rPr>
+                <w:rFonts w:hint="default" w:eastAsia="Times New Roman" w:cs="Times New Roman"/>
+                <w:sz w:val="20"/>
+                <w:szCs w:val="20"/>
+                <w:lang w:val="vi-VN"/>
+              </w:rPr>
+              <w:t>}</w:t>
             </w:r>
           </w:p>
         </w:tc>
@@ -3004,8 +3272,7 @@
         </w:tblPrEx>
         <w:tc>
           <w:tcPr>
-            <w:tcW w:w="3388" w:type="dxa"/>
-            <w:gridSpan w:val="4"/>
+            <w:tcW w:w="572" w:type="dxa"/>
             <w:tcBorders>
               <w:top w:val="single" w:color="auto" w:sz="4" w:space="0"/>
               <w:left w:val="single" w:color="auto" w:sz="4" w:space="0"/>
@@ -3026,27 +3293,332 @@
               <w:jc w:val="center"/>
               <w:rPr>
                 <w:rFonts w:hint="default" w:ascii="Times New Roman" w:hAnsi="Times New Roman" w:eastAsia="Times New Roman" w:cs="Times New Roman"/>
-                <w:b/>
-                <w:bCs/>
-                <w:sz w:val="20"/>
-                <w:szCs w:val="20"/>
-              </w:rPr>
-            </w:pPr>
-            <w:r>
-              <w:rPr>
-                <w:rFonts w:hint="default" w:ascii="Times New Roman" w:hAnsi="Times New Roman" w:eastAsia="Times New Roman" w:cs="Times New Roman"/>
-                <w:b/>
-                <w:bCs/>
-                <w:sz w:val="20"/>
-                <w:szCs w:val="20"/>
-              </w:rPr>
-              <w:t>Tổng giá gói thầu</w:t>
+                <w:sz w:val="20"/>
+                <w:szCs w:val="20"/>
+              </w:rPr>
+            </w:pPr>
+            <w:r>
+              <w:rPr>
+                <w:rFonts w:hint="default" w:ascii="Times New Roman" w:hAnsi="Times New Roman" w:eastAsia="Times New Roman" w:cs="Times New Roman"/>
+                <w:sz w:val="20"/>
+                <w:szCs w:val="20"/>
+              </w:rPr>
+              <w:t>2</w:t>
             </w:r>
           </w:p>
         </w:tc>
         <w:tc>
           <w:tcPr>
-            <w:tcW w:w="1295" w:type="dxa"/>
+            <w:tcW w:w="711" w:type="dxa"/>
+            <w:tcBorders>
+              <w:top w:val="single" w:color="auto" w:sz="4" w:space="0"/>
+              <w:left w:val="single" w:color="auto" w:sz="4" w:space="0"/>
+              <w:bottom w:val="single" w:color="auto" w:sz="4" w:space="0"/>
+              <w:right w:val="single" w:color="auto" w:sz="4" w:space="0"/>
+            </w:tcBorders>
+            <w:noWrap w:val="0"/>
+            <w:vAlign w:val="center"/>
+          </w:tcPr>
+          <w:p>
+            <w:pPr>
+              <w:keepNext w:val="0"/>
+              <w:keepLines w:val="0"/>
+              <w:widowControl/>
+              <w:suppressLineNumbers w:val="0"/>
+              <w:spacing w:before="0" w:beforeAutospacing="0" w:after="0" w:afterAutospacing="0"/>
+              <w:ind w:left="0" w:right="0"/>
+              <w:jc w:val="center"/>
+              <w:rPr>
+                <w:rFonts w:hint="default" w:ascii="Times New Roman" w:hAnsi="Times New Roman" w:eastAsia="Times New Roman" w:cs="Times New Roman"/>
+                <w:bCs/>
+                <w:sz w:val="20"/>
+                <w:szCs w:val="20"/>
+              </w:rPr>
+            </w:pPr>
+            <w:r>
+              <w:rPr>
+                <w:rFonts w:hint="default" w:ascii="Times New Roman" w:hAnsi="Times New Roman" w:eastAsia="Times New Roman" w:cs="Times New Roman"/>
+                <w:bCs/>
+                <w:sz w:val="20"/>
+                <w:szCs w:val="20"/>
+              </w:rPr>
+              <w:t>Công ty Trực thăng Miền Nam</w:t>
+            </w:r>
+          </w:p>
+        </w:tc>
+        <w:tc>
+          <w:tcPr>
+            <w:tcW w:w="840" w:type="dxa"/>
+            <w:tcBorders>
+              <w:top w:val="single" w:color="auto" w:sz="4" w:space="0"/>
+              <w:left w:val="single" w:color="auto" w:sz="4" w:space="0"/>
+              <w:bottom w:val="single" w:color="auto" w:sz="4" w:space="0"/>
+              <w:right w:val="single" w:color="auto" w:sz="4" w:space="0"/>
+            </w:tcBorders>
+            <w:noWrap w:val="0"/>
+            <w:vAlign w:val="center"/>
+          </w:tcPr>
+          <w:p>
+            <w:pPr>
+              <w:keepNext w:val="0"/>
+              <w:keepLines w:val="0"/>
+              <w:widowControl/>
+              <w:suppressLineNumbers w:val="0"/>
+              <w:spacing w:before="0" w:beforeAutospacing="0" w:after="0" w:afterAutospacing="0"/>
+              <w:ind w:left="0" w:right="0"/>
+              <w:jc w:val="center"/>
+              <w:rPr>
+                <w:rFonts w:hint="default" w:ascii="Times New Roman" w:hAnsi="Times New Roman" w:eastAsia="Times New Roman" w:cs="Times New Roman"/>
+                <w:sz w:val="20"/>
+                <w:szCs w:val="20"/>
+              </w:rPr>
+            </w:pPr>
+            <w:r>
+              <w:rPr>
+                <w:rFonts w:hint="default" w:ascii="Times New Roman" w:hAnsi="Times New Roman" w:eastAsia="Times New Roman" w:cs="Times New Roman"/>
+                <w:bCs/>
+                <w:sz w:val="20"/>
+                <w:szCs w:val="20"/>
+              </w:rPr>
+              <w:t>Tư vấn Thẩm tra BCKTKT</w:t>
+            </w:r>
+          </w:p>
+        </w:tc>
+        <w:tc>
+          <w:tcPr>
+            <w:tcW w:w="1265" w:type="dxa"/>
+            <w:tcBorders>
+              <w:top w:val="single" w:color="auto" w:sz="4" w:space="0"/>
+              <w:left w:val="single" w:color="auto" w:sz="4" w:space="0"/>
+              <w:bottom w:val="single" w:color="auto" w:sz="4" w:space="0"/>
+              <w:right w:val="single" w:color="auto" w:sz="4" w:space="0"/>
+            </w:tcBorders>
+            <w:noWrap w:val="0"/>
+            <w:vAlign w:val="center"/>
+          </w:tcPr>
+          <w:p>
+            <w:pPr>
+              <w:keepNext w:val="0"/>
+              <w:keepLines w:val="0"/>
+              <w:widowControl/>
+              <w:suppressLineNumbers w:val="0"/>
+              <w:spacing w:before="0" w:beforeAutospacing="0" w:after="0" w:afterAutospacing="0"/>
+              <w:ind w:left="0" w:right="0"/>
+              <w:jc w:val="center"/>
+              <w:rPr>
+                <w:rFonts w:hint="default" w:ascii="Times New Roman" w:hAnsi="Times New Roman" w:eastAsia="Times New Roman" w:cs="Times New Roman"/>
+                <w:sz w:val="20"/>
+                <w:szCs w:val="20"/>
+              </w:rPr>
+            </w:pPr>
+            <w:r>
+              <w:rPr>
+                <w:rFonts w:hint="default" w:ascii="Times New Roman" w:hAnsi="Times New Roman" w:eastAsia="Times New Roman" w:cs="Times New Roman"/>
+                <w:sz w:val="20"/>
+                <w:szCs w:val="20"/>
+              </w:rPr>
+              <w:t>Thẩm tra bản vẽ thiết kế kỹ thuật thi công, dự toán công trình</w:t>
+            </w:r>
+          </w:p>
+        </w:tc>
+        <w:tc>
+          <w:tcPr>
+            <w:tcW w:w="1149" w:type="dxa"/>
+            <w:tcBorders>
+              <w:top w:val="single" w:color="auto" w:sz="4" w:space="0"/>
+              <w:left w:val="single" w:color="auto" w:sz="4" w:space="0"/>
+              <w:bottom w:val="single" w:color="auto" w:sz="4" w:space="0"/>
+              <w:right w:val="single" w:color="auto" w:sz="4" w:space="0"/>
+            </w:tcBorders>
+            <w:noWrap w:val="0"/>
+            <w:vAlign w:val="center"/>
+          </w:tcPr>
+          <w:p>
+            <w:pPr>
+              <w:keepNext w:val="0"/>
+              <w:keepLines w:val="0"/>
+              <w:widowControl/>
+              <w:suppressLineNumbers w:val="0"/>
+              <w:spacing w:before="0" w:beforeAutospacing="0" w:after="0" w:afterAutospacing="0"/>
+              <w:ind w:left="0" w:right="0"/>
+              <w:jc w:val="center"/>
+              <w:rPr>
+                <w:rFonts w:hint="default" w:ascii="Times New Roman" w:hAnsi="Times New Roman" w:eastAsia="Times New Roman" w:cs="Times New Roman"/>
+                <w:bCs/>
+                <w:sz w:val="20"/>
+                <w:szCs w:val="20"/>
+                <w:highlight w:val="yellow"/>
+              </w:rPr>
+            </w:pPr>
+            <w:r>
+              <w:rPr>
+                <w:rFonts w:hint="default" w:ascii="Times New Roman" w:hAnsi="Times New Roman" w:eastAsia="Times New Roman" w:cs="Times New Roman"/>
+                <w:bCs/>
+                <w:sz w:val="20"/>
+                <w:szCs w:val="20"/>
+                <w:highlight w:val="yellow"/>
+              </w:rPr>
+              <w:t>5.000.000</w:t>
+            </w:r>
+          </w:p>
+        </w:tc>
+        <w:tc>
+          <w:tcPr>
+            <w:tcW w:w="700" w:type="dxa"/>
+            <w:tcBorders>
+              <w:top w:val="single" w:color="auto" w:sz="4" w:space="0"/>
+              <w:left w:val="single" w:color="auto" w:sz="4" w:space="0"/>
+              <w:bottom w:val="single" w:color="auto" w:sz="4" w:space="0"/>
+              <w:right w:val="single" w:color="auto" w:sz="4" w:space="0"/>
+            </w:tcBorders>
+            <w:noWrap w:val="0"/>
+            <w:vAlign w:val="center"/>
+          </w:tcPr>
+          <w:p>
+            <w:pPr>
+              <w:keepNext w:val="0"/>
+              <w:keepLines w:val="0"/>
+              <w:widowControl/>
+              <w:suppressLineNumbers w:val="0"/>
+              <w:spacing w:before="0" w:beforeAutospacing="0" w:after="0" w:afterAutospacing="0"/>
+              <w:ind w:left="0" w:right="0"/>
+              <w:jc w:val="center"/>
+              <w:rPr>
+                <w:rFonts w:hint="default" w:ascii="Times New Roman" w:hAnsi="Times New Roman" w:eastAsia="Times New Roman" w:cs="Times New Roman"/>
+                <w:bCs/>
+                <w:sz w:val="20"/>
+                <w:szCs w:val="20"/>
+                <w:highlight w:val="yellow"/>
+              </w:rPr>
+            </w:pPr>
+            <w:r>
+              <w:rPr>
+                <w:rFonts w:hint="default" w:ascii="Times New Roman" w:hAnsi="Times New Roman" w:eastAsia="Times New Roman" w:cs="Times New Roman"/>
+                <w:sz w:val="20"/>
+                <w:szCs w:val="20"/>
+              </w:rPr>
+              <w:t xml:space="preserve">Chi phí SXKD năm </w:t>
+            </w:r>
+            <w:r>
+              <w:rPr>
+                <w:rFonts w:hint="default" w:ascii="Times New Roman" w:hAnsi="Times New Roman" w:eastAsia="Times New Roman" w:cs="Times New Roman"/>
+                <w:sz w:val="20"/>
+                <w:szCs w:val="20"/>
+                <w:highlight w:val="yellow"/>
+              </w:rPr>
+              <w:t>2025</w:t>
+            </w:r>
+          </w:p>
+        </w:tc>
+        <w:tc>
+          <w:tcPr>
+            <w:tcW w:w="951" w:type="dxa"/>
+            <w:tcBorders>
+              <w:top w:val="single" w:color="auto" w:sz="4" w:space="0"/>
+              <w:left w:val="single" w:color="auto" w:sz="4" w:space="0"/>
+              <w:bottom w:val="single" w:color="auto" w:sz="4" w:space="0"/>
+              <w:right w:val="single" w:color="auto" w:sz="4" w:space="0"/>
+            </w:tcBorders>
+            <w:noWrap w:val="0"/>
+            <w:vAlign w:val="center"/>
+          </w:tcPr>
+          <w:p>
+            <w:pPr>
+              <w:keepNext w:val="0"/>
+              <w:keepLines w:val="0"/>
+              <w:widowControl/>
+              <w:suppressLineNumbers w:val="0"/>
+              <w:spacing w:before="0" w:beforeAutospacing="0" w:after="0" w:afterAutospacing="0"/>
+              <w:ind w:left="0" w:right="0"/>
+              <w:jc w:val="center"/>
+              <w:rPr>
+                <w:rFonts w:hint="default" w:ascii="Times New Roman" w:hAnsi="Times New Roman" w:eastAsia="Times New Roman" w:cs="Times New Roman"/>
+                <w:bCs/>
+                <w:sz w:val="20"/>
+                <w:szCs w:val="20"/>
+              </w:rPr>
+            </w:pPr>
+            <w:r>
+              <w:rPr>
+                <w:rFonts w:hint="default" w:ascii="Times New Roman" w:hAnsi="Times New Roman" w:eastAsia="Times New Roman" w:cs="Times New Roman"/>
+                <w:bCs/>
+                <w:sz w:val="20"/>
+                <w:szCs w:val="20"/>
+              </w:rPr>
+              <w:t>Chỉ định thầu</w:t>
+            </w:r>
+          </w:p>
+          <w:p>
+            <w:pPr>
+              <w:keepNext w:val="0"/>
+              <w:keepLines w:val="0"/>
+              <w:widowControl/>
+              <w:suppressLineNumbers w:val="0"/>
+              <w:spacing w:before="0" w:beforeAutospacing="0" w:after="0" w:afterAutospacing="0"/>
+              <w:ind w:left="0" w:right="0"/>
+              <w:jc w:val="center"/>
+              <w:rPr>
+                <w:rFonts w:hint="default" w:ascii="Times New Roman" w:hAnsi="Times New Roman" w:eastAsia="Times New Roman" w:cs="Times New Roman"/>
+                <w:bCs/>
+                <w:sz w:val="20"/>
+                <w:szCs w:val="20"/>
+              </w:rPr>
+            </w:pPr>
+            <w:r>
+              <w:rPr>
+                <w:rFonts w:hint="default" w:ascii="Times New Roman" w:hAnsi="Times New Roman" w:eastAsia="Times New Roman" w:cs="Times New Roman"/>
+                <w:bCs/>
+                <w:sz w:val="20"/>
+                <w:szCs w:val="20"/>
+              </w:rPr>
+              <w:t>rút gọn</w:t>
+            </w:r>
+          </w:p>
+        </w:tc>
+        <w:tc>
+          <w:tcPr>
+            <w:tcW w:w="1120" w:type="dxa"/>
+            <w:tcBorders>
+              <w:top w:val="single" w:color="auto" w:sz="4" w:space="0"/>
+              <w:left w:val="single" w:color="auto" w:sz="4" w:space="0"/>
+              <w:bottom w:val="single" w:color="auto" w:sz="4" w:space="0"/>
+              <w:right w:val="single" w:color="auto" w:sz="4" w:space="0"/>
+            </w:tcBorders>
+            <w:noWrap w:val="0"/>
+            <w:vAlign w:val="center"/>
+          </w:tcPr>
+          <w:p>
+            <w:pPr>
+              <w:keepNext w:val="0"/>
+              <w:keepLines w:val="0"/>
+              <w:widowControl/>
+              <w:suppressLineNumbers w:val="0"/>
+              <w:spacing w:before="0" w:beforeAutospacing="0" w:after="0" w:afterAutospacing="0"/>
+              <w:ind w:left="0" w:right="0"/>
+              <w:jc w:val="center"/>
+              <w:rPr>
+                <w:rFonts w:hint="default" w:ascii="Times New Roman" w:hAnsi="Times New Roman" w:eastAsia="Times New Roman" w:cs="Times New Roman"/>
+                <w:bCs/>
+                <w:sz w:val="20"/>
+                <w:szCs w:val="20"/>
+                <w:highlight w:val="yellow"/>
+              </w:rPr>
+            </w:pPr>
+            <w:r>
+              <w:rPr>
+                <w:rFonts w:hint="default" w:ascii="Times New Roman" w:hAnsi="Times New Roman" w:eastAsia="Times New Roman" w:cs="Times New Roman"/>
+                <w:bCs/>
+                <w:sz w:val="20"/>
+                <w:szCs w:val="20"/>
+                <w:highlight w:val="yellow"/>
+              </w:rPr>
+              <w:t>Tháng 10/2025</w:t>
+            </w:r>
+          </w:p>
+        </w:tc>
+        <w:tc>
+          <w:tcPr>
+            <w:tcW w:w="840" w:type="dxa"/>
             <w:tcBorders>
               <w:top w:val="single" w:color="auto" w:sz="4" w:space="0"/>
               <w:left w:val="single" w:color="auto" w:sz="4" w:space="0"/>
@@ -3069,27 +3641,172 @@
               <w:widowControl/>
               <w:suppressLineNumbers w:val="0"/>
               <w:spacing w:before="0" w:beforeAutospacing="0" w:after="0" w:afterAutospacing="0"/>
-              <w:ind w:left="0" w:right="57"/>
-              <w:jc w:val="right"/>
-              <w:rPr>
-                <w:rFonts w:hint="default" w:ascii="Times New Roman" w:hAnsi="Times New Roman" w:eastAsia="Times New Roman" w:cs="Times New Roman"/>
-                <w:b/>
-                <w:sz w:val="20"/>
-                <w:szCs w:val="20"/>
-                <w:highlight w:val="none"/>
-                <w:lang w:val="en-US"/>
-              </w:rPr>
-            </w:pPr>
-            <w:r>
-              <w:rPr>
-                <w:rFonts w:hint="default" w:eastAsia="Times New Roman" w:cs="Times New Roman"/>
-                <w:b/>
-                <w:sz w:val="20"/>
-                <w:szCs w:val="20"/>
-                <w:highlight w:val="none"/>
-                <w:lang w:val="en-US"/>
-              </w:rPr>
-              <w:t>{packagesAmount}</w:t>
+              <w:ind w:left="0" w:right="0"/>
+              <w:jc w:val="center"/>
+              <w:rPr>
+                <w:rFonts w:hint="default" w:ascii="Times New Roman" w:hAnsi="Times New Roman" w:eastAsia="Times New Roman" w:cs="Times New Roman"/>
+                <w:bCs/>
+                <w:sz w:val="20"/>
+                <w:szCs w:val="20"/>
+              </w:rPr>
+            </w:pPr>
+            <w:r>
+              <w:rPr>
+                <w:rFonts w:hint="default" w:ascii="Times New Roman" w:hAnsi="Times New Roman" w:eastAsia="Times New Roman" w:cs="Times New Roman"/>
+                <w:bCs/>
+                <w:sz w:val="20"/>
+                <w:szCs w:val="20"/>
+              </w:rPr>
+              <w:t>Trọn gói</w:t>
+            </w:r>
+          </w:p>
+        </w:tc>
+        <w:tc>
+          <w:tcPr>
+            <w:tcW w:w="980" w:type="dxa"/>
+            <w:tcBorders>
+              <w:top w:val="single" w:color="auto" w:sz="4" w:space="0"/>
+              <w:left w:val="single" w:color="auto" w:sz="4" w:space="0"/>
+              <w:bottom w:val="single" w:color="auto" w:sz="4" w:space="0"/>
+              <w:right w:val="single" w:color="auto" w:sz="4" w:space="0"/>
+            </w:tcBorders>
+            <w:noWrap w:val="0"/>
+            <w:tcMar>
+              <w:top w:w="0" w:type="dxa"/>
+              <w:left w:w="108" w:type="dxa"/>
+              <w:bottom w:w="0" w:type="dxa"/>
+              <w:right w:w="108" w:type="dxa"/>
+            </w:tcMar>
+            <w:vAlign w:val="center"/>
+          </w:tcPr>
+          <w:p>
+            <w:pPr>
+              <w:keepNext w:val="0"/>
+              <w:keepLines w:val="0"/>
+              <w:widowControl/>
+              <w:suppressLineNumbers w:val="0"/>
+              <w:spacing w:before="0" w:beforeAutospacing="0" w:after="0" w:afterAutospacing="0"/>
+              <w:ind w:left="0" w:right="0"/>
+              <w:jc w:val="center"/>
+              <w:rPr>
+                <w:rFonts w:hint="default" w:ascii="Times New Roman" w:hAnsi="Times New Roman" w:eastAsia="Times New Roman" w:cs="Times New Roman"/>
+                <w:bCs/>
+                <w:sz w:val="20"/>
+                <w:szCs w:val="20"/>
+                <w:highlight w:val="yellow"/>
+              </w:rPr>
+            </w:pPr>
+            <w:r>
+              <w:rPr>
+                <w:rFonts w:hint="default" w:ascii="Times New Roman" w:hAnsi="Times New Roman" w:eastAsia="Times New Roman" w:cs="Times New Roman"/>
+                <w:bCs/>
+                <w:sz w:val="20"/>
+                <w:szCs w:val="20"/>
+                <w:highlight w:val="yellow"/>
+              </w:rPr>
+              <w:t>07 ngày</w:t>
+            </w:r>
+          </w:p>
+        </w:tc>
+      </w:tr>
+      <w:tr>
+        <w:tblPrEx>
+          <w:tblBorders>
+            <w:top w:val="single" w:color="auto" w:sz="4" w:space="0"/>
+            <w:left w:val="single" w:color="auto" w:sz="4" w:space="0"/>
+            <w:bottom w:val="single" w:color="auto" w:sz="4" w:space="0"/>
+            <w:right w:val="single" w:color="auto" w:sz="4" w:space="0"/>
+            <w:insideH w:val="single" w:color="auto" w:sz="4" w:space="0"/>
+            <w:insideV w:val="single" w:color="auto" w:sz="4" w:space="0"/>
+          </w:tblBorders>
+        </w:tblPrEx>
+        <w:tc>
+          <w:tcPr>
+            <w:tcW w:w="3388" w:type="dxa"/>
+            <w:gridSpan w:val="4"/>
+            <w:tcBorders>
+              <w:top w:val="single" w:color="auto" w:sz="4" w:space="0"/>
+              <w:left w:val="single" w:color="auto" w:sz="4" w:space="0"/>
+              <w:bottom w:val="single" w:color="auto" w:sz="4" w:space="0"/>
+              <w:right w:val="single" w:color="auto" w:sz="4" w:space="0"/>
+            </w:tcBorders>
+            <w:noWrap w:val="0"/>
+            <w:vAlign w:val="center"/>
+          </w:tcPr>
+          <w:p>
+            <w:pPr>
+              <w:keepNext w:val="0"/>
+              <w:keepLines w:val="0"/>
+              <w:widowControl/>
+              <w:suppressLineNumbers w:val="0"/>
+              <w:spacing w:before="0" w:beforeAutospacing="0" w:after="0" w:afterAutospacing="0"/>
+              <w:ind w:left="0" w:right="0"/>
+              <w:jc w:val="center"/>
+              <w:rPr>
+                <w:rFonts w:hint="default" w:ascii="Times New Roman" w:hAnsi="Times New Roman" w:eastAsia="Times New Roman" w:cs="Times New Roman"/>
+                <w:b/>
+                <w:bCs/>
+                <w:sz w:val="20"/>
+                <w:szCs w:val="20"/>
+              </w:rPr>
+            </w:pPr>
+            <w:r>
+              <w:rPr>
+                <w:rFonts w:hint="default" w:ascii="Times New Roman" w:hAnsi="Times New Roman" w:eastAsia="Times New Roman" w:cs="Times New Roman"/>
+                <w:b/>
+                <w:bCs/>
+                <w:sz w:val="20"/>
+                <w:szCs w:val="20"/>
+              </w:rPr>
+              <w:t>Tổng giá gói thầu</w:t>
+            </w:r>
+          </w:p>
+        </w:tc>
+        <w:tc>
+          <w:tcPr>
+            <w:tcW w:w="1149" w:type="dxa"/>
+            <w:tcBorders>
+              <w:top w:val="single" w:color="auto" w:sz="4" w:space="0"/>
+              <w:left w:val="single" w:color="auto" w:sz="4" w:space="0"/>
+              <w:bottom w:val="single" w:color="auto" w:sz="4" w:space="0"/>
+              <w:right w:val="single" w:color="auto" w:sz="4" w:space="0"/>
+            </w:tcBorders>
+            <w:noWrap w:val="0"/>
+            <w:tcMar>
+              <w:top w:w="0" w:type="dxa"/>
+              <w:left w:w="108" w:type="dxa"/>
+              <w:bottom w:w="0" w:type="dxa"/>
+              <w:right w:w="108" w:type="dxa"/>
+            </w:tcMar>
+            <w:vAlign w:val="center"/>
+          </w:tcPr>
+          <w:p>
+            <w:pPr>
+              <w:keepNext w:val="0"/>
+              <w:keepLines w:val="0"/>
+              <w:widowControl/>
+              <w:suppressLineNumbers w:val="0"/>
+              <w:spacing w:before="0" w:beforeAutospacing="0" w:after="0" w:afterAutospacing="0"/>
+              <w:ind w:left="0" w:right="0"/>
+              <w:jc w:val="center"/>
+              <w:rPr>
+                <w:rFonts w:hint="default" w:ascii="Times New Roman" w:hAnsi="Times New Roman" w:eastAsia="Times New Roman" w:cs="Times New Roman"/>
+                <w:b/>
+                <w:sz w:val="20"/>
+                <w:szCs w:val="20"/>
+                <w:highlight w:val="yellow"/>
+              </w:rPr>
+            </w:pPr>
+            <w:r>
+              <w:rPr>
+                <w:rFonts w:hint="default" w:ascii="Times New Roman" w:hAnsi="Times New Roman" w:eastAsia="Times New Roman" w:cs="Times New Roman"/>
+                <w:b/>
+                <w:bCs/>
+                <w:sz w:val="20"/>
+                <w:szCs w:val="20"/>
+                <w:highlight w:val="yellow"/>
+              </w:rPr>
+              <w:t>48.000.000</w:t>
             </w:r>
           </w:p>
         </w:tc>
@@ -3275,26 +3992,213 @@
     </w:tbl>
     <w:p>
       <w:pPr>
-        <w:widowControl w:val="0"/>
-        <w:tabs>
-          <w:tab w:val="left" w:pos="900"/>
-        </w:tabs>
         <w:spacing w:before="120"/>
         <w:ind w:firstLine="720"/>
         <w:jc w:val="both"/>
         <w:rPr>
-          <w:rFonts w:eastAsia="Times New Roman"/>
           <w:b/>
           <w:bCs/>
+          <w:color w:val="000000"/>
         </w:rPr>
       </w:pPr>
       <w:r>
         <w:rPr>
-          <w:rFonts w:eastAsia="Times New Roman"/>
           <w:b/>
           <w:bCs/>
+          <w:color w:val="000000"/>
         </w:rPr>
         <w:t>2. Giải trình nội dung Kế hoạch lựa chọn nhà thầu</w:t>
+      </w:r>
+    </w:p>
+    <w:p>
+      <w:pPr>
+        <w:widowControl w:val="0"/>
+        <w:spacing w:before="120"/>
+        <w:ind w:firstLine="720"/>
+        <w:jc w:val="both"/>
+        <w:rPr>
+          <w:rFonts w:eastAsia="Times New Roman"/>
+          <w:i/>
+          <w:lang w:val="it-IT"/>
+        </w:rPr>
+      </w:pPr>
+      <w:r>
+        <w:rPr>
+          <w:rFonts w:eastAsia="Times New Roman"/>
+          <w:lang w:val="it-IT"/>
+        </w:rPr>
+        <w:t>a) Cơ sở phân chia các gói thầu: Căn cứ vào tính chất của từng nội dung công việc.</w:t>
+      </w:r>
+    </w:p>
+    <w:p>
+      <w:pPr>
+        <w:widowControl w:val="0"/>
+        <w:spacing w:before="120"/>
+        <w:ind w:firstLine="720"/>
+        <w:jc w:val="both"/>
+        <w:rPr>
+          <w:rFonts w:eastAsia="Times New Roman"/>
+          <w:lang w:val="it-IT"/>
+        </w:rPr>
+      </w:pPr>
+      <w:r>
+        <w:rPr>
+          <w:rFonts w:eastAsia="Times New Roman"/>
+          <w:lang w:val="it-IT"/>
+        </w:rPr>
+        <w:t>b) Giá gói thầu: Tạm tính theo định mức của nhà nước.</w:t>
+      </w:r>
+    </w:p>
+    <w:p>
+      <w:pPr>
+        <w:widowControl w:val="0"/>
+        <w:tabs>
+          <w:tab w:val="left" w:pos="567"/>
+          <w:tab w:val="left" w:pos="1134"/>
+          <w:tab w:val="left" w:pos="1701"/>
+        </w:tabs>
+        <w:autoSpaceDE w:val="0"/>
+        <w:autoSpaceDN w:val="0"/>
+        <w:adjustRightInd w:val="0"/>
+        <w:spacing w:before="120"/>
+        <w:ind w:right="-45" w:firstLine="720"/>
+        <w:jc w:val="both"/>
+        <w:rPr>
+          <w:iCs/>
+          <w:spacing w:val="-4"/>
+        </w:rPr>
+      </w:pPr>
+      <w:r>
+        <w:rPr>
+          <w:rFonts w:eastAsia="Times New Roman"/>
+          <w:spacing w:val="-6"/>
+          <w:lang w:val="it-IT"/>
+        </w:rPr>
+        <w:t xml:space="preserve">c) Nguồn vốn: </w:t>
+      </w:r>
+      <w:r>
+        <w:t xml:space="preserve">Chi phí sản xuất kinh doanh năm </w:t>
+      </w:r>
+      <w:r>
+        <w:rPr>
+          <w:rFonts w:hint="default"/>
+          <w:highlight w:val="yellow"/>
+          <w:lang w:val="en-US"/>
+        </w:rPr>
+        <w:t>{source_of_funds}</w:t>
+      </w:r>
+      <w:r>
+        <w:rPr>
+          <w:iCs/>
+          <w:spacing w:val="-4"/>
+        </w:rPr>
+        <w:t>.</w:t>
+      </w:r>
+    </w:p>
+    <w:p>
+      <w:pPr>
+        <w:widowControl w:val="0"/>
+        <w:tabs>
+          <w:tab w:val="left" w:pos="567"/>
+          <w:tab w:val="left" w:pos="1134"/>
+          <w:tab w:val="left" w:pos="1701"/>
+        </w:tabs>
+        <w:autoSpaceDE w:val="0"/>
+        <w:autoSpaceDN w:val="0"/>
+        <w:adjustRightInd w:val="0"/>
+        <w:spacing w:before="120"/>
+        <w:ind w:right="-45" w:firstLine="720"/>
+        <w:jc w:val="both"/>
+        <w:rPr>
+          <w:rFonts w:eastAsia="Times New Roman"/>
+          <w:lang w:val="it-IT"/>
+        </w:rPr>
+      </w:pPr>
+      <w:r>
+        <w:rPr>
+          <w:rFonts w:eastAsia="Times New Roman"/>
+          <w:lang w:val="it-IT"/>
+        </w:rPr>
+        <w:t xml:space="preserve">d) Hình thức lựa chọn nhà thầu: </w:t>
+      </w:r>
+    </w:p>
+    <w:p>
+      <w:pPr>
+        <w:spacing w:before="120"/>
+        <w:ind w:firstLine="720"/>
+        <w:jc w:val="both"/>
+        <w:rPr>
+          <w:rFonts w:eastAsia="Times New Roman"/>
+          <w:iCs/>
+          <w:color w:val="000000"/>
+          <w:spacing w:val="-2"/>
+          <w:lang w:val="nl-NL"/>
+        </w:rPr>
+      </w:pPr>
+      <w:r>
+        <w:rPr>
+          <w:rFonts w:eastAsia="Times New Roman"/>
+          <w:lang w:val="it-IT"/>
+        </w:rPr>
+        <w:t xml:space="preserve"> Hình thức lựa chọn nhà thầu:</w:t>
+      </w:r>
+      <w:r>
+        <w:rPr>
+          <w:rFonts w:eastAsia="Times New Roman"/>
+          <w:bCs/>
+          <w:color w:val="000000"/>
+          <w:lang w:val="it-IT"/>
+        </w:rPr>
+        <w:t xml:space="preserve"> Giá gói thầu nằm trong hạn mức được chỉ định thầu rút gọn theo quy định tại </w:t>
+      </w:r>
+      <w:r>
+        <w:rPr>
+          <w:rFonts w:eastAsia="Times New Roman"/>
+          <w:iCs/>
+          <w:color w:val="000000"/>
+          <w:spacing w:val="-2"/>
+          <w:lang w:val="nl-NL"/>
+        </w:rPr>
+        <w:t>Luật Đấu thầu số 22/2023/QH15 được Quốc hội thông qua ngày 23/6/2023</w:t>
+      </w:r>
+      <w:r>
+        <w:rPr>
+          <w:rFonts w:eastAsia="Times New Roman"/>
+          <w:iCs/>
+          <w:color w:val="000000"/>
+          <w:spacing w:val="-4"/>
+          <w:lang w:val="nl-NL"/>
+        </w:rPr>
+        <w:t xml:space="preserve"> nên Liên Cơ quan kiến nghị áp dụng hình thức </w:t>
+      </w:r>
+      <w:r>
+        <w:rPr>
+          <w:rFonts w:eastAsia="Times New Roman"/>
+          <w:bCs/>
+          <w:color w:val="000000"/>
+          <w:lang w:val="it-IT"/>
+        </w:rPr>
+        <w:t>là chỉ định thầu rút gọn.</w:t>
+      </w:r>
+    </w:p>
+    <w:p>
+      <w:pPr>
+        <w:widowControl w:val="0"/>
+        <w:spacing w:before="120"/>
+        <w:ind w:firstLine="720"/>
+        <w:jc w:val="both"/>
+        <w:rPr>
+          <w:rFonts w:eastAsia="Times New Roman"/>
+          <w:i/>
+          <w:lang w:val="it-IT"/>
+        </w:rPr>
+      </w:pPr>
+      <w:r>
+        <w:rPr>
+          <w:rFonts w:eastAsia="Times New Roman"/>
+          <w:lang w:val="it-IT"/>
+        </w:rPr>
+        <w:t>đ) Thời gian bắt đầu tổ chức lựa chọn nhà thầu: Tháng 10/2025 (sau khi có Quyết định phê duyệt Kế hoạch lựa chọn nhà thầu)</w:t>
       </w:r>
     </w:p>
     <w:p>
@@ -3317,7 +4221,7 @@
           <w:rFonts w:eastAsia="Times New Roman"/>
           <w:lang w:val="it-IT"/>
         </w:rPr>
-        <w:t>a) Cơ sở phân chia các gói thầu: Căn cứ vào tính chất của từng nội dung công việc.</w:t>
+        <w:t>e) Loại hợp đồng: Hợp đồng trọn gói.</w:t>
       </w:r>
     </w:p>
     <w:p>
@@ -3339,7 +4243,7 @@
           <w:rFonts w:eastAsia="Times New Roman"/>
           <w:lang w:val="it-IT"/>
         </w:rPr>
-        <w:t>b) Giá gói thầu: Tạm tính theo định mức của nhà nước.</w:t>
+        <w:t xml:space="preserve">g) Thời gian thực hiện hợp đồng: Để bảo đảm tiến độ và chất lượng hồ sơ Báo cáo kinh tế kỹ thuật trình Giám đốc phê duyệt, Liên Cơ quan kiến nghị thời gian thực hiện hợp đồng của các gói thầu là: </w:t>
       </w:r>
     </w:p>
     <w:p>
@@ -3353,7 +4257,7 @@
         <w:jc w:val="both"/>
         <w:rPr>
           <w:rFonts w:eastAsia="Times New Roman"/>
-          <w:iCs/>
+          <w:lang w:val="it-IT"/>
         </w:rPr>
       </w:pPr>
       <w:r>
@@ -3361,25 +4265,21 @@
           <w:rFonts w:eastAsia="Times New Roman"/>
           <w:lang w:val="it-IT"/>
         </w:rPr>
-        <w:t xml:space="preserve">c) Nguồn vốn: </w:t>
+        <w:t xml:space="preserve">+ Tư vấn lập BCKTKT: </w:t>
+      </w:r>
+      <w:r>
+        <w:rPr>
+          <w:rFonts w:hint="default" w:eastAsia="Times New Roman"/>
+          <w:highlight w:val="yellow"/>
+          <w:lang w:val="en-US"/>
+        </w:rPr>
+        <w:t>{bidPackages[0].duration}</w:t>
       </w:r>
       <w:r>
         <w:rPr>
           <w:rFonts w:eastAsia="Times New Roman"/>
-        </w:rPr>
-        <w:t xml:space="preserve">Chi phí sản xuất kinh doanh năm </w:t>
-      </w:r>
-      <w:r>
-        <w:rPr>
-          <w:rFonts w:hint="default" w:eastAsia="Times New Roman"/>
-          <w:lang w:val="en-US"/>
-        </w:rPr>
-        <w:t>{sourceOfFunds}</w:t>
-      </w:r>
-      <w:r>
-        <w:rPr>
-          <w:rFonts w:eastAsia="Times New Roman"/>
-          <w:iCs/>
+          <w:highlight w:val="yellow"/>
+          <w:lang w:val="it-IT"/>
         </w:rPr>
         <w:t>.</w:t>
       </w:r>
@@ -3403,227 +4303,23 @@
           <w:rFonts w:eastAsia="Times New Roman"/>
           <w:lang w:val="it-IT"/>
         </w:rPr>
-        <w:t xml:space="preserve">d) Hình thức lựa chọn nhà thầu: </w:t>
-      </w:r>
-    </w:p>
-    <w:p>
-      <w:pPr>
-        <w:widowControl w:val="0"/>
-        <w:tabs>
-          <w:tab w:val="left" w:pos="900"/>
-        </w:tabs>
-        <w:spacing w:before="120"/>
-        <w:ind w:firstLine="720"/>
-        <w:jc w:val="both"/>
+        <w:t xml:space="preserve">+ Tư vấn thẩm tra BCKTKT: </w:t>
+      </w:r>
+      <w:r>
+        <w:rPr>
+          <w:rFonts w:hint="default" w:eastAsia="Times New Roman"/>
+          <w:highlight w:val="yellow"/>
+          <w:lang w:val="en-US"/>
+        </w:rPr>
+        <w:t>{bidPackages[1].duration}</w:t>
+      </w:r>
+      <w:r>
         <w:rPr>
           <w:rFonts w:eastAsia="Times New Roman"/>
-          <w:iCs/>
-          <w:lang w:val="nl-NL"/>
-        </w:rPr>
-      </w:pPr>
-      <w:r>
-        <w:rPr>
-          <w:rFonts w:eastAsia="Times New Roman"/>
+          <w:highlight w:val="yellow"/>
           <w:lang w:val="it-IT"/>
         </w:rPr>
-        <w:t xml:space="preserve"> Hình thức lựa chọn nhà thầu:</w:t>
-      </w:r>
-      <w:r>
-        <w:rPr>
-          <w:rFonts w:eastAsia="Times New Roman"/>
-          <w:bCs/>
-          <w:lang w:val="it-IT"/>
-        </w:rPr>
-        <w:t xml:space="preserve"> Áp dụng theo khoản 7, điều 3, Luật Đấu thầu số </w:t>
-      </w:r>
-      <w:r>
-        <w:rPr>
-          <w:rFonts w:eastAsia="Times New Roman"/>
-          <w:iCs/>
-        </w:rPr>
-        <w:t xml:space="preserve">22/2023/QH15 được Quốc hội thông qua ngày 23/6/2023; </w:t>
-      </w:r>
-      <w:r>
-        <w:rPr>
-          <w:rFonts w:eastAsia="Times New Roman"/>
-          <w:bCs/>
-          <w:lang w:val="it-IT"/>
-        </w:rPr>
-        <w:t xml:space="preserve">điều 78 và 80 Nghị định </w:t>
-      </w:r>
-      <w:r>
-        <w:rPr>
-          <w:rFonts w:eastAsia="Times New Roman"/>
-          <w:iCs/>
-        </w:rPr>
-        <w:t xml:space="preserve">số </w:t>
-      </w:r>
-      <w:r>
-        <w:rPr>
-          <w:rFonts w:eastAsia="Times New Roman"/>
-        </w:rPr>
-        <w:t>214/2025/NĐ-CP ngày 04/8/2025 quy định chi tiết một số điều và biện pháp thi hành Luật Đấu thầu 2023 về lựa chọn nhà thầu.</w:t>
-      </w:r>
-    </w:p>
-    <w:p>
-      <w:pPr>
-        <w:widowControl w:val="0"/>
-        <w:tabs>
-          <w:tab w:val="left" w:pos="900"/>
-        </w:tabs>
-        <w:spacing w:before="120"/>
-        <w:ind w:firstLine="720"/>
-        <w:jc w:val="both"/>
-        <w:rPr>
-          <w:rFonts w:eastAsia="Times New Roman"/>
-          <w:i/>
-          <w:lang w:val="it-IT"/>
-        </w:rPr>
-      </w:pPr>
-      <w:r>
-        <w:rPr>
-          <w:rFonts w:eastAsia="Times New Roman"/>
-          <w:lang w:val="it-IT"/>
-        </w:rPr>
-        <w:t xml:space="preserve">đ) Thời gian bắt đầu tổ chức lựa chọn nhà thầu: </w:t>
-      </w:r>
-      <w:r>
-        <w:rPr>
-          <w:rFonts w:hint="default" w:eastAsia="Times New Roman"/>
-          <w:lang w:val="en-US"/>
-        </w:rPr>
-        <w:t xml:space="preserve">{bidPackages[0].bidderSelectionTime} </w:t>
-      </w:r>
-      <w:r>
-        <w:rPr>
-          <w:rFonts w:eastAsia="Times New Roman"/>
-          <w:lang w:val="it-IT"/>
-        </w:rPr>
-        <w:t>(sau khi có Quyết định phê duyệt Kế hoạch lựa chọn nhà thầu).</w:t>
-      </w:r>
-    </w:p>
-    <w:p>
-      <w:pPr>
-        <w:widowControl w:val="0"/>
-        <w:tabs>
-          <w:tab w:val="left" w:pos="900"/>
-        </w:tabs>
-        <w:spacing w:before="120"/>
-        <w:ind w:firstLine="720"/>
-        <w:jc w:val="both"/>
-        <w:rPr>
-          <w:rFonts w:eastAsia="Times New Roman"/>
-          <w:i/>
-          <w:lang w:val="it-IT"/>
-        </w:rPr>
-      </w:pPr>
-      <w:r>
-        <w:rPr>
-          <w:rFonts w:eastAsia="Times New Roman"/>
-          <w:lang w:val="it-IT"/>
-        </w:rPr>
-        <w:t xml:space="preserve">e) Loại hợp đồng: Hợp đồng </w:t>
-      </w:r>
-      <w:r>
-        <w:rPr>
-          <w:rFonts w:hint="default" w:eastAsia="Times New Roman"/>
-          <w:lang w:val="en-US"/>
-        </w:rPr>
-        <w:t>tr</w:t>
-      </w:r>
-      <w:r>
-        <w:rPr>
-          <w:rFonts w:hint="default" w:eastAsia="Times New Roman"/>
-          <w:lang w:val="vi-VN"/>
-        </w:rPr>
-        <w:t>ọn gói</w:t>
-      </w:r>
-      <w:r>
-        <w:rPr>
-          <w:rFonts w:eastAsia="Times New Roman"/>
-          <w:lang w:val="it-IT"/>
-        </w:rPr>
         <w:t>.</w:t>
-      </w:r>
-    </w:p>
-    <w:p>
-      <w:pPr>
-        <w:widowControl w:val="0"/>
-        <w:tabs>
-          <w:tab w:val="left" w:pos="900"/>
-        </w:tabs>
-        <w:spacing w:before="120"/>
-        <w:ind w:firstLine="720"/>
-        <w:jc w:val="both"/>
-        <w:rPr>
-          <w:rFonts w:eastAsia="Times New Roman"/>
-          <w:lang w:val="it-IT"/>
-        </w:rPr>
-      </w:pPr>
-      <w:r>
-        <w:rPr>
-          <w:rFonts w:eastAsia="Times New Roman"/>
-          <w:lang w:val="it-IT"/>
-        </w:rPr>
-        <w:t xml:space="preserve">g) Thời gian thực hiện hợp đồng: Để bảo đảm tiến độ và chất lượng hồ sơ Báo cáo kinh tế kỹ thuật trình Giám đốc phê duyệt, Liên Cơ quan kiến nghị thời gian thực hiện hợp đồng của các gói thầu là: </w:t>
-      </w:r>
-    </w:p>
-    <w:p>
-      <w:pPr>
-        <w:widowControl w:val="0"/>
-        <w:tabs>
-          <w:tab w:val="left" w:pos="900"/>
-        </w:tabs>
-        <w:spacing w:before="120"/>
-        <w:ind w:firstLine="720"/>
-        <w:jc w:val="both"/>
-        <w:rPr>
-          <w:rFonts w:hint="default" w:eastAsia="Times New Roman"/>
-          <w:lang w:val="en-US"/>
-        </w:rPr>
-      </w:pPr>
-      <w:r>
-        <w:rPr>
-          <w:rFonts w:eastAsia="Times New Roman"/>
-          <w:lang w:val="it-IT"/>
-        </w:rPr>
-        <w:t xml:space="preserve">+ Tư vấn lập BCKTKT: </w:t>
-      </w:r>
-      <w:r>
-        <w:rPr>
-          <w:rFonts w:hint="default" w:eastAsia="Times New Roman"/>
-          <w:lang w:val="en-US"/>
-        </w:rPr>
-        <w:t>{bidPackages[0].upTo}.</w:t>
-      </w:r>
-    </w:p>
-    <w:p>
-      <w:pPr>
-        <w:widowControl w:val="0"/>
-        <w:tabs>
-          <w:tab w:val="left" w:pos="900"/>
-        </w:tabs>
-        <w:spacing w:before="120"/>
-        <w:ind w:firstLine="720"/>
-        <w:jc w:val="both"/>
-        <w:rPr>
-          <w:rFonts w:eastAsia="Times New Roman"/>
-          <w:lang w:val="it-IT"/>
-        </w:rPr>
-      </w:pPr>
-      <w:r>
-        <w:rPr>
-          <w:rFonts w:eastAsia="Times New Roman"/>
-          <w:lang w:val="it-IT"/>
-        </w:rPr>
-        <w:t xml:space="preserve">+ Tư vấn thẩm tra BCKTKT: </w:t>
-      </w:r>
-      <w:r>
-        <w:rPr>
-          <w:rFonts w:hint="default" w:eastAsia="Times New Roman"/>
-          <w:lang w:val="en-US"/>
-        </w:rPr>
-        <w:t>{bidPackages[1].upTo}.</w:t>
       </w:r>
     </w:p>
     <w:p>
@@ -3705,89 +4401,45 @@
           <w:spacing w:val="-4"/>
           <w:lang w:val="nl-NL"/>
         </w:rPr>
-        <w:t xml:space="preserve">gói thầu </w:t>
-      </w:r>
-      <w:r>
-        <w:rPr>
-          <w:rFonts w:hint="default"/>
-          <w:iCs/>
-          <w:color w:val="000000"/>
-          <w:spacing w:val="-4"/>
-          <w:lang w:val="en-US"/>
-        </w:rPr>
-        <w:t>{#packages}</w:t>
-      </w:r>
-      <w:r>
-        <w:rPr>
-          <w:rFonts w:hint="default"/>
+        <w:t>gói thầu “</w:t>
+      </w:r>
+      <w:r>
+        <w:rPr>
           <w:i/>
-          <w:iCs w:val="0"/>
-          <w:color w:val="000000"/>
-          <w:spacing w:val="-4"/>
-          <w:lang w:val="en-US"/>
-        </w:rPr>
-        <w:t>”{bidPackageName}”{</w:t>
-      </w:r>
-      <w:r>
-        <w:rPr>
-          <w:rFonts w:hint="default"/>
-          <w:i/>
-          <w:iCs w:val="0"/>
-          <w:color w:val="000000"/>
-          <w:spacing w:val="-4"/>
-          <w:lang w:val="vi-VN"/>
-        </w:rPr>
-        <w:t>^</w:t>
-      </w:r>
-      <w:r>
-        <w:rPr>
-          <w:rFonts w:hint="default"/>
-          <w:i/>
-          <w:iCs w:val="0"/>
-          <w:color w:val="000000"/>
-          <w:spacing w:val="-4"/>
-          <w:lang w:val="en-US"/>
-        </w:rPr>
-        <w:t>isLast}</w:t>
-      </w:r>
-      <w:r>
-        <w:rPr>
-          <w:rFonts w:hint="default"/>
-          <w:iCs/>
-          <w:color w:val="000000"/>
-          <w:spacing w:val="-4"/>
-          <w:lang w:val="en-US"/>
-        </w:rPr>
-        <w:t>,</w:t>
-      </w:r>
-      <w:r>
-        <w:rPr>
-          <w:rFonts w:hint="default"/>
-          <w:iCs/>
-          <w:color w:val="000000"/>
-          <w:spacing w:val="-4"/>
-          <w:lang w:val="vi-VN"/>
-        </w:rPr>
-        <w:t xml:space="preserve"> và gói thầu </w:t>
-      </w:r>
-      <w:r>
-        <w:rPr>
-          <w:rFonts w:hint="default"/>
-          <w:iCs/>
-          <w:color w:val="000000"/>
-          <w:spacing w:val="-4"/>
-          <w:lang w:val="en-US"/>
-        </w:rPr>
-        <w:t>{/isLast}{/packages}</w:t>
-      </w:r>
-      <w:r>
-        <w:rPr>
           <w:iCs/>
           <w:color w:val="000000"/>
           <w:spacing w:val="-4"/>
           <w:lang w:val="nl-NL"/>
         </w:rPr>
-        <w:t xml:space="preserve">, thuộc công trình </w:t>
+        <w:t>Tư vấn lập BCKTKT</w:t>
+      </w:r>
+      <w:r>
+        <w:rPr>
+          <w:iCs/>
+          <w:color w:val="000000"/>
+          <w:spacing w:val="-4"/>
+          <w:lang w:val="nl-NL"/>
+        </w:rPr>
+        <w:t>” và gói thầu “</w:t>
+      </w:r>
+      <w:r>
+        <w:rPr>
+          <w:i/>
+          <w:iCs/>
+          <w:color w:val="000000"/>
+          <w:spacing w:val="-4"/>
+          <w:lang w:val="nl-NL"/>
+        </w:rPr>
+        <w:t>Tư vấn Thẩm tra BCKTKT</w:t>
+      </w:r>
+      <w:r>
+        <w:rPr>
+          <w:iCs/>
+          <w:color w:val="000000"/>
+          <w:spacing w:val="-4"/>
+          <w:lang w:val="nl-NL"/>
+        </w:rPr>
+        <w:t xml:space="preserve">”, thuộc công trình </w:t>
       </w:r>
       <w:r>
         <w:rPr>
@@ -3802,8 +4454,7 @@
         <w:rPr>
           <w:rFonts w:hint="default"/>
           <w:i/>
-          <w:color w:val="000000"/>
-          <w:spacing w:val="-4"/>
+          <w:highlight w:val="yellow"/>
           <w:lang w:val="en-US"/>
         </w:rPr>
         <w:t>{name}</w:t>
@@ -3860,11 +4511,8 @@
       </w:tblPr>
       <w:tblGrid>
         <w:gridCol w:w="1951"/>
-        <w:gridCol w:w="1711"/>
-        <w:gridCol w:w="2400"/>
-        <w:gridCol w:w="1848"/>
-        <w:gridCol w:w="1276"/>
-        <w:gridCol w:w="420"/>
+        <w:gridCol w:w="3686"/>
+        <w:gridCol w:w="3969"/>
       </w:tblGrid>
       <w:tr>
         <w:tblPrEx>
@@ -3878,6 +4526,7 @@
         <w:tc>
           <w:tcPr>
             <w:tcW w:w="1951" w:type="dxa"/>
+            <w:shd w:val="clear" w:color="auto" w:fill="auto"/>
             <w:noWrap w:val="0"/>
             <w:vAlign w:val="top"/>
           </w:tcPr>
@@ -3980,8 +4629,8 @@
         </w:tc>
         <w:tc>
           <w:tcPr>
-            <w:tcW w:w="4111" w:type="dxa"/>
-            <w:gridSpan w:val="2"/>
+            <w:tcW w:w="3686" w:type="dxa"/>
+            <w:shd w:val="clear" w:color="auto" w:fill="auto"/>
             <w:noWrap w:val="0"/>
             <w:vAlign w:val="top"/>
           </w:tcPr>
@@ -4090,24 +4739,11 @@
               <w:t>Nguyễn Anh Đức</w:t>
             </w:r>
           </w:p>
-          <w:p>
-            <w:pPr>
-              <w:keepNext w:val="0"/>
-              <w:keepLines w:val="0"/>
-              <w:widowControl/>
-              <w:suppressLineNumbers w:val="0"/>
-              <w:spacing w:before="120" w:beforeAutospacing="0" w:after="120" w:afterAutospacing="0"/>
-              <w:ind w:left="0" w:right="0"/>
-              <w:rPr>
-                <w:rFonts w:hint="default" w:ascii="Times New Roman" w:hAnsi="Times New Roman" w:cs="Times New Roman"/>
-              </w:rPr>
-            </w:pPr>
-          </w:p>
         </w:tc>
         <w:tc>
           <w:tcPr>
-            <w:tcW w:w="3544" w:type="dxa"/>
-            <w:gridSpan w:val="3"/>
+            <w:tcW w:w="3969" w:type="dxa"/>
+            <w:shd w:val="clear" w:color="auto" w:fill="auto"/>
             <w:noWrap w:val="0"/>
             <w:vAlign w:val="top"/>
           </w:tcPr>
@@ -4231,86 +4867,30 @@
           </w:p>
         </w:tc>
       </w:tr>
-      <w:tr>
-        <w:tblPrEx>
-          <w:tblCellMar>
-            <w:top w:w="0" w:type="dxa"/>
-            <w:left w:w="108" w:type="dxa"/>
-            <w:bottom w:w="0" w:type="dxa"/>
-            <w:right w:w="108" w:type="dxa"/>
-          </w:tblCellMar>
-        </w:tblPrEx>
-        <w:trPr>
-          <w:gridAfter w:val="1"/>
-          <w:wAfter w:w="420" w:type="dxa"/>
-        </w:trPr>
-        <w:tc>
-          <w:tcPr>
-            <w:tcW w:w="3662" w:type="dxa"/>
-            <w:gridSpan w:val="2"/>
-            <w:noWrap w:val="0"/>
-            <w:vAlign w:val="top"/>
-          </w:tcPr>
-          <w:p>
-            <w:pPr>
-              <w:keepNext w:val="0"/>
-              <w:keepLines w:val="0"/>
-              <w:widowControl/>
-              <w:suppressLineNumbers w:val="0"/>
-              <w:spacing w:before="120" w:beforeAutospacing="0" w:after="120" w:afterAutospacing="0"/>
-              <w:ind w:left="0" w:right="0"/>
-              <w:jc w:val="both"/>
-              <w:rPr>
-                <w:rFonts w:hint="default" w:ascii="Times New Roman" w:hAnsi="Times New Roman" w:cs="Times New Roman"/>
-              </w:rPr>
-            </w:pPr>
-          </w:p>
-        </w:tc>
-        <w:tc>
-          <w:tcPr>
-            <w:tcW w:w="4248" w:type="dxa"/>
-            <w:gridSpan w:val="2"/>
-            <w:noWrap w:val="0"/>
-            <w:vAlign w:val="top"/>
-          </w:tcPr>
-          <w:p>
-            <w:pPr>
-              <w:keepNext w:val="0"/>
-              <w:keepLines w:val="0"/>
-              <w:widowControl/>
-              <w:suppressLineNumbers w:val="0"/>
-              <w:spacing w:before="120" w:beforeAutospacing="0" w:after="0" w:afterAutospacing="0"/>
-              <w:ind w:left="0" w:right="0"/>
-              <w:jc w:val="center"/>
-              <w:rPr>
-                <w:rFonts w:hint="default" w:ascii="Times New Roman" w:hAnsi="Times New Roman" w:cs="Times New Roman"/>
-              </w:rPr>
-            </w:pPr>
-          </w:p>
-        </w:tc>
-        <w:tc>
-          <w:tcPr>
-            <w:tcW w:w="1276" w:type="dxa"/>
-            <w:noWrap w:val="0"/>
-            <w:vAlign w:val="top"/>
-          </w:tcPr>
-          <w:p>
-            <w:pPr>
-              <w:keepNext w:val="0"/>
-              <w:keepLines w:val="0"/>
-              <w:widowControl/>
-              <w:suppressLineNumbers w:val="0"/>
-              <w:spacing w:before="120" w:beforeAutospacing="0" w:after="120" w:afterAutospacing="0"/>
-              <w:ind w:left="0" w:right="0"/>
-              <w:jc w:val="both"/>
-              <w:rPr>
-                <w:rFonts w:hint="default" w:ascii="Times New Roman" w:hAnsi="Times New Roman" w:cs="Times New Roman"/>
-              </w:rPr>
-            </w:pPr>
-          </w:p>
-        </w:tc>
-      </w:tr>
     </w:tbl>
+    <w:p>
+      <w:pPr>
+        <w:rPr>
+          <w:b/>
+        </w:rPr>
+      </w:pPr>
+    </w:p>
+    <w:p>
+      <w:pPr>
+        <w:jc w:val="center"/>
+        <w:rPr>
+          <w:b/>
+        </w:rPr>
+      </w:pPr>
+    </w:p>
+    <w:p>
+      <w:pPr>
+        <w:jc w:val="center"/>
+        <w:rPr>
+          <w:b/>
+        </w:rPr>
+      </w:pPr>
+    </w:p>
     <w:p>
       <w:pPr>
         <w:jc w:val="center"/>
@@ -4352,24 +4932,24 @@
       <w:pStyle w:val="7"/>
       <w:framePr w:wrap="around" w:vAnchor="text" w:hAnchor="margin" w:xAlign="right" w:y="1"/>
       <w:rPr>
-        <w:rStyle w:val="11"/>
+        <w:rStyle w:val="10"/>
       </w:rPr>
     </w:pPr>
     <w:r>
       <w:rPr>
-        <w:rStyle w:val="11"/>
+        <w:rStyle w:val="10"/>
       </w:rPr>
       <w:fldChar w:fldCharType="begin"/>
     </w:r>
     <w:r>
       <w:rPr>
-        <w:rStyle w:val="11"/>
+        <w:rStyle w:val="10"/>
       </w:rPr>
       <w:instrText xml:space="preserve">PAGE  </w:instrText>
     </w:r>
     <w:r>
       <w:rPr>
-        <w:rStyle w:val="11"/>
+        <w:rStyle w:val="10"/>
       </w:rPr>
       <w:fldChar w:fldCharType="end"/>
     </w:r>
@@ -4390,36 +4970,36 @@
       <w:pStyle w:val="8"/>
       <w:framePr w:wrap="around" w:vAnchor="text" w:hAnchor="margin" w:xAlign="center" w:y="1"/>
       <w:rPr>
-        <w:rStyle w:val="11"/>
+        <w:rStyle w:val="10"/>
       </w:rPr>
     </w:pPr>
     <w:r>
       <w:rPr>
-        <w:rStyle w:val="11"/>
+        <w:rStyle w:val="10"/>
       </w:rPr>
       <w:fldChar w:fldCharType="begin"/>
     </w:r>
     <w:r>
       <w:rPr>
-        <w:rStyle w:val="11"/>
+        <w:rStyle w:val="10"/>
       </w:rPr>
       <w:instrText xml:space="preserve">PAGE  </w:instrText>
     </w:r>
     <w:r>
       <w:rPr>
-        <w:rStyle w:val="11"/>
+        <w:rStyle w:val="10"/>
       </w:rPr>
       <w:fldChar w:fldCharType="separate"/>
     </w:r>
     <w:r>
       <w:rPr>
-        <w:rStyle w:val="11"/>
+        <w:rStyle w:val="10"/>
       </w:rPr>
       <w:t>3</w:t>
     </w:r>
     <w:r>
       <w:rPr>
-        <w:rStyle w:val="11"/>
+        <w:rStyle w:val="10"/>
       </w:rPr>
       <w:fldChar w:fldCharType="end"/>
     </w:r>
@@ -4429,7 +5009,7 @@
       <w:pStyle w:val="8"/>
       <w:framePr w:wrap="auto" w:vAnchor="text" w:hAnchor="margin" w:xAlign="center" w:y="1"/>
       <w:rPr>
-        <w:rStyle w:val="11"/>
+        <w:rStyle w:val="10"/>
       </w:rPr>
     </w:pPr>
   </w:p>
@@ -4448,24 +5028,24 @@
       <w:pStyle w:val="8"/>
       <w:framePr w:wrap="around" w:vAnchor="text" w:hAnchor="margin" w:xAlign="center" w:y="1"/>
       <w:rPr>
-        <w:rStyle w:val="11"/>
+        <w:rStyle w:val="10"/>
       </w:rPr>
     </w:pPr>
     <w:r>
       <w:rPr>
-        <w:rStyle w:val="11"/>
+        <w:rStyle w:val="10"/>
       </w:rPr>
       <w:fldChar w:fldCharType="begin"/>
     </w:r>
     <w:r>
       <w:rPr>
-        <w:rStyle w:val="11"/>
+        <w:rStyle w:val="10"/>
       </w:rPr>
       <w:instrText xml:space="preserve">PAGE  </w:instrText>
     </w:r>
     <w:r>
       <w:rPr>
-        <w:rStyle w:val="11"/>
+        <w:rStyle w:val="10"/>
       </w:rPr>
       <w:fldChar w:fldCharType="end"/>
     </w:r>
@@ -4520,8 +5100,8 @@
     <w:lsdException w:unhideWhenUsed="0" w:uiPriority="0" w:semiHidden="0" w:name="Normal Indent"/>
     <w:lsdException w:unhideWhenUsed="0" w:uiPriority="0" w:semiHidden="0" w:name="footnote text"/>
     <w:lsdException w:unhideWhenUsed="0" w:uiPriority="0" w:semiHidden="0" w:name="annotation text"/>
-    <w:lsdException w:qFormat="1" w:unhideWhenUsed="0" w:uiPriority="0" w:semiHidden="0" w:name="header"/>
-    <w:lsdException w:qFormat="1" w:unhideWhenUsed="0" w:uiPriority="0" w:semiHidden="0" w:name="footer"/>
+    <w:lsdException w:unhideWhenUsed="0" w:uiPriority="0" w:semiHidden="0" w:name="header"/>
+    <w:lsdException w:unhideWhenUsed="0" w:uiPriority="0" w:semiHidden="0" w:name="footer"/>
     <w:lsdException w:unhideWhenUsed="0" w:uiPriority="0" w:semiHidden="0" w:name="index heading"/>
     <w:lsdException w:qFormat="1" w:uiPriority="0" w:name="caption"/>
     <w:lsdException w:unhideWhenUsed="0" w:uiPriority="0" w:semiHidden="0" w:name="table of figures"/>
@@ -4530,7 +5110,7 @@
     <w:lsdException w:unhideWhenUsed="0" w:uiPriority="0" w:semiHidden="0" w:name="footnote reference"/>
     <w:lsdException w:unhideWhenUsed="0" w:uiPriority="0" w:semiHidden="0" w:name="annotation reference"/>
     <w:lsdException w:unhideWhenUsed="0" w:uiPriority="0" w:semiHidden="0" w:name="line number"/>
-    <w:lsdException w:qFormat="1" w:unhideWhenUsed="0" w:uiPriority="0" w:semiHidden="0" w:name="page number"/>
+    <w:lsdException w:unhideWhenUsed="0" w:uiPriority="0" w:semiHidden="0" w:name="page number"/>
     <w:lsdException w:unhideWhenUsed="0" w:uiPriority="0" w:semiHidden="0" w:name="endnote reference"/>
     <w:lsdException w:unhideWhenUsed="0" w:uiPriority="0" w:semiHidden="0" w:name="endnote text"/>
     <w:lsdException w:unhideWhenUsed="0" w:uiPriority="0" w:semiHidden="0" w:name="table of authorities"/>
@@ -4543,7 +5123,7 @@
     <w:lsdException w:unhideWhenUsed="0" w:uiPriority="0" w:semiHidden="0" w:name="List 3"/>
     <w:lsdException w:unhideWhenUsed="0" w:uiPriority="0" w:semiHidden="0" w:name="List 4"/>
     <w:lsdException w:unhideWhenUsed="0" w:uiPriority="0" w:semiHidden="0" w:name="List 5"/>
-    <w:lsdException w:qFormat="1" w:unhideWhenUsed="0" w:uiPriority="0" w:semiHidden="0" w:name="List Bullet 2"/>
+    <w:lsdException w:unhideWhenUsed="0" w:uiPriority="0" w:semiHidden="0" w:name="List Bullet 2"/>
     <w:lsdException w:unhideWhenUsed="0" w:uiPriority="0" w:semiHidden="0" w:name="List Bullet 3"/>
     <w:lsdException w:unhideWhenUsed="0" w:uiPriority="0" w:semiHidden="0" w:name="List Bullet 4"/>
     <w:lsdException w:unhideWhenUsed="0" w:uiPriority="0" w:semiHidden="0" w:name="List Bullet 5"/>
@@ -4574,7 +5154,7 @@
     <w:lsdException w:unhideWhenUsed="0" w:uiPriority="0" w:semiHidden="0" w:name="Body Text Indent 2"/>
     <w:lsdException w:unhideWhenUsed="0" w:uiPriority="0" w:semiHidden="0" w:name="Body Text Indent 3"/>
     <w:lsdException w:unhideWhenUsed="0" w:uiPriority="0" w:semiHidden="0" w:name="Block Text"/>
-    <w:lsdException w:qFormat="1" w:unhideWhenUsed="0" w:uiPriority="0" w:semiHidden="0" w:name="Hyperlink"/>
+    <w:lsdException w:unhideWhenUsed="0" w:uiPriority="0" w:semiHidden="0" w:name="Hyperlink"/>
     <w:lsdException w:unhideWhenUsed="0" w:uiPriority="0" w:semiHidden="0" w:name="FollowedHyperlink"/>
     <w:lsdException w:qFormat="1" w:unhideWhenUsed="0" w:uiPriority="0" w:semiHidden="0" w:name="Strong"/>
     <w:lsdException w:qFormat="1" w:unhideWhenUsed="0" w:uiPriority="0" w:semiHidden="0" w:name="Emphasis"/>
@@ -4636,8 +5216,8 @@
     <w:lsdException w:unhideWhenUsed="0" w:uiPriority="0" w:semiHidden="0" w:name="Table Web 1"/>
     <w:lsdException w:unhideWhenUsed="0" w:uiPriority="0" w:semiHidden="0" w:name="Table Web 2"/>
     <w:lsdException w:unhideWhenUsed="0" w:uiPriority="0" w:semiHidden="0" w:name="Table Web 3"/>
-    <w:lsdException w:qFormat="1" w:unhideWhenUsed="0" w:uiPriority="0" w:name="Balloon Text"/>
-    <w:lsdException w:qFormat="1" w:unhideWhenUsed="0" w:uiPriority="0" w:semiHidden="0" w:name="Table Grid"/>
+    <w:lsdException w:unhideWhenUsed="0" w:uiPriority="0" w:name="Balloon Text"/>
+    <w:lsdException w:unhideWhenUsed="0" w:uiPriority="39" w:semiHidden="0" w:name="Table Grid"/>
     <w:lsdException w:unhideWhenUsed="0" w:uiPriority="0" w:semiHidden="0" w:name="Table Theme"/>
     <w:lsdException w:unhideWhenUsed="0" w:uiPriority="60" w:semiHidden="0" w:name="Light Shading"/>
     <w:lsdException w:unhideWhenUsed="0" w:uiPriority="61" w:semiHidden="0" w:name="Light List"/>
@@ -4818,7 +5398,6 @@
     <w:name w:val="Balloon Text"/>
     <w:basedOn w:val="1"/>
     <w:semiHidden/>
-    <w:qFormat/>
     <w:uiPriority w:val="0"/>
     <w:rPr>
       <w:rFonts w:ascii="Tahoma" w:hAnsi="Tahoma" w:cs="Tahoma"/>
@@ -4829,7 +5408,6 @@
   <w:style w:type="paragraph" w:styleId="7">
     <w:name w:val="footer"/>
     <w:basedOn w:val="1"/>
-    <w:qFormat/>
     <w:uiPriority w:val="0"/>
     <w:pPr>
       <w:tabs>
@@ -4841,7 +5419,6 @@
   <w:style w:type="paragraph" w:styleId="8">
     <w:name w:val="header"/>
     <w:basedOn w:val="1"/>
-    <w:qFormat/>
     <w:uiPriority w:val="0"/>
     <w:pPr>
       <w:tabs>
@@ -4850,19 +5427,9 @@
       </w:tabs>
     </w:pPr>
   </w:style>
-  <w:style w:type="character" w:styleId="9">
-    <w:name w:val="Hyperlink"/>
-    <w:qFormat/>
-    <w:uiPriority w:val="0"/>
-    <w:rPr>
-      <w:color w:val="0563C1"/>
-      <w:u w:val="single"/>
-    </w:rPr>
-  </w:style>
-  <w:style w:type="paragraph" w:styleId="10">
+  <w:style w:type="paragraph" w:styleId="9">
     <w:name w:val="List Bullet 2"/>
     <w:basedOn w:val="1"/>
-    <w:qFormat/>
     <w:uiPriority w:val="0"/>
     <w:pPr>
       <w:numPr>
@@ -4878,16 +5445,14 @@
       <w:lang w:val="en-GB"/>
     </w:rPr>
   </w:style>
-  <w:style w:type="character" w:styleId="11">
+  <w:style w:type="character" w:styleId="10">
     <w:name w:val="page number"/>
-    <w:qFormat/>
     <w:uiPriority w:val="0"/>
   </w:style>
-  <w:style w:type="table" w:styleId="12">
+  <w:style w:type="table" w:styleId="11">
     <w:name w:val="Table Grid"/>
     <w:basedOn w:val="5"/>
-    <w:qFormat/>
-    <w:uiPriority w:val="0"/>
+    <w:uiPriority w:val="39"/>
     <w:rPr>
       <w:lang w:bidi="ar-SA"/>
     </w:rPr>
@@ -4902,9 +5467,8 @@
       </w:tblBorders>
     </w:tblPr>
   </w:style>
-  <w:style w:type="paragraph" w:customStyle="1" w:styleId="13">
+  <w:style w:type="paragraph" w:customStyle="1" w:styleId="12">
     <w:name w:val=" Char"/>
-    <w:qFormat/>
     <w:uiPriority w:val="0"/>
     <w:pPr>
       <w:tabs>
@@ -4919,10 +5483,9 @@
       <w:lang w:val="en-US" w:eastAsia="en-US" w:bidi="ar-SA"/>
     </w:rPr>
   </w:style>
-  <w:style w:type="paragraph" w:customStyle="1" w:styleId="14">
+  <w:style w:type="paragraph" w:customStyle="1" w:styleId="13">
     <w:name w:val="Char Char1 Char"/>
     <w:basedOn w:val="1"/>
-    <w:qFormat/>
     <w:uiPriority w:val="0"/>
     <w:pPr>
       <w:widowControl w:val="0"/>
@@ -4935,9 +5498,8 @@
       <w:lang w:eastAsia="zh-CN"/>
     </w:rPr>
   </w:style>
-  <w:style w:type="paragraph" w:customStyle="1" w:styleId="15">
+  <w:style w:type="paragraph" w:customStyle="1" w:styleId="14">
     <w:name w:val=" Char Char Char Char Char Char Char"/>
-    <w:qFormat/>
     <w:uiPriority w:val="0"/>
     <w:pPr>
       <w:tabs>
@@ -4952,11 +5514,10 @@
       <w:lang w:val="en-US" w:eastAsia="en-US" w:bidi="ar-SA"/>
     </w:rPr>
   </w:style>
-  <w:style w:type="paragraph" w:customStyle="1" w:styleId="16">
+  <w:style w:type="paragraph" w:customStyle="1" w:styleId="15">
     <w:name w:val="1"/>
     <w:basedOn w:val="1"/>
-    <w:link w:val="17"/>
-    <w:qFormat/>
+    <w:link w:val="16"/>
     <w:uiPriority w:val="0"/>
     <w:pPr>
       <w:autoSpaceDE w:val="0"/>
@@ -4972,10 +5533,9 @@
       <w:lang w:val="fr-FR"/>
     </w:rPr>
   </w:style>
-  <w:style w:type="character" w:customStyle="1" w:styleId="17">
+  <w:style w:type="character" w:customStyle="1" w:styleId="16">
     <w:name w:val="1.Tiêu đề Char Char"/>
-    <w:link w:val="16"/>
-    <w:qFormat/>
+    <w:link w:val="15"/>
     <w:uiPriority w:val="0"/>
     <w:rPr>
       <w:rFonts w:eastAsia="Times New Roman"/>
@@ -4984,16 +5544,6 @@
       <w:sz w:val="28"/>
       <w:szCs w:val="28"/>
       <w:lang w:val="fr-FR"/>
-    </w:rPr>
-  </w:style>
-  <w:style w:type="character" w:customStyle="1" w:styleId="18">
-    <w:name w:val="Unresolved Mention"/>
-    <w:unhideWhenUsed/>
-    <w:qFormat/>
-    <w:uiPriority w:val="99"/>
-    <w:rPr>
-      <w:color w:val="605E5C"/>
-      <w:shd w:val="clear" w:color="auto" w:fill="E1DFDD"/>
     </w:rPr>
   </w:style>
 </w:styles>

</xml_diff>

<commit_message>
add docx-generation service & 4 docx templates
</commit_message>
<xml_diff>
--- a/public/template/2. Tờ trình phê duyệt KHLCNT.docx
+++ b/public/template/2. Tờ trình phê duyệt KHLCNT.docx
@@ -942,6 +942,9 @@
         <w:spacing w:before="120"/>
         <w:ind w:firstLine="720"/>
         <w:jc w:val="both"/>
+        <w:rPr>
+          <w:highlight w:val="yellow"/>
+        </w:rPr>
       </w:pPr>
       <w:r>
         <w:t xml:space="preserve">- Chi phí sửa chữa (dự kiến): </w:t>
@@ -954,13 +957,23 @@
           <w:highlight w:val="yellow"/>
           <w:lang w:val="en-US"/>
         </w:rPr>
-        <w:t>{est_cost}</w:t>
-      </w:r>
-      <w:r>
-        <w:rPr>
+        <w:t>{e</w:t>
+      </w:r>
+      <w:r>
+        <w:rPr>
+          <w:rFonts w:hint="default"/>
           <w:b/>
           <w:bCs/>
-          <w:highlight w:val="yellow"/>
+          <w:highlight w:val="none"/>
+          <w:lang w:val="en-US"/>
+        </w:rPr>
+        <w:t>st_cost}</w:t>
+      </w:r>
+      <w:r>
+        <w:rPr>
+          <w:b/>
+          <w:bCs/>
+          <w:highlight w:val="none"/>
         </w:rPr>
         <w:t xml:space="preserve"> </w:t>
       </w:r>
@@ -969,7 +982,7 @@
           <w:b/>
           <w:bCs/>
           <w:spacing w:val="-8"/>
-          <w:highlight w:val="yellow"/>
+          <w:highlight w:val="none"/>
           <w:lang w:val="nl-NL"/>
         </w:rPr>
         <w:t>đồng</w:t>
@@ -977,7 +990,7 @@
       <w:r>
         <w:rPr>
           <w:spacing w:val="-8"/>
-          <w:highlight w:val="yellow"/>
+          <w:highlight w:val="none"/>
           <w:lang w:val="nl-NL"/>
         </w:rPr>
         <w:t xml:space="preserve"> </w:t>
@@ -986,7 +999,7 @@
         <w:rPr>
           <w:i/>
           <w:spacing w:val="-8"/>
-          <w:highlight w:val="yellow"/>
+          <w:highlight w:val="none"/>
           <w:lang w:val="nl-NL"/>
         </w:rPr>
         <w:t xml:space="preserve">(Bằng chữ: </w:t>
@@ -1121,7 +1134,7 @@
       </w:r>
       <w:r>
         <w:rPr>
-          <w:highlight w:val="yellow"/>
+          <w:highlight w:val="none"/>
         </w:rPr>
         <w:t>.</w:t>
       </w:r>
@@ -1154,12 +1167,14 @@
         </w:rPr>
         <w:t>{repair_scope}</w:t>
       </w:r>
-      <w:r>
-        <w:rPr>
-          <w:highlight w:val="yellow"/>
+      <w:bookmarkStart w:id="3" w:name="_GoBack"/>
+      <w:r>
+        <w:rPr>
+          <w:highlight w:val="none"/>
         </w:rPr>
         <w:t>.</w:t>
       </w:r>
+      <w:bookmarkEnd w:id="3"/>
     </w:p>
     <w:p>
       <w:pPr>
@@ -2722,9 +2737,19 @@
                 <w:rFonts w:hint="default" w:eastAsia="Times New Roman" w:cs="Times New Roman"/>
                 <w:sz w:val="20"/>
                 <w:szCs w:val="20"/>
+                <w:highlight w:val="yellow"/>
                 <w:lang w:val="vi-VN"/>
               </w:rPr>
-              <w:t>{#bi</w:t>
+              <w:t>{</w:t>
+            </w:r>
+            <w:r>
+              <w:rPr>
+                <w:rFonts w:hint="default" w:eastAsia="Times New Roman" w:cs="Times New Roman"/>
+                <w:sz w:val="20"/>
+                <w:szCs w:val="20"/>
+                <w:lang w:val="vi-VN"/>
+              </w:rPr>
+              <w:t>#bi</w:t>
             </w:r>
             <w:r>
               <w:rPr>
@@ -2801,9 +2826,20 @@
                 <w:bCs/>
                 <w:sz w:val="20"/>
                 <w:szCs w:val="20"/>
+                <w:highlight w:val="none"/>
                 <w:lang w:val="en-US"/>
               </w:rPr>
-              <w:t>project_owner}</w:t>
+              <w:t>pr</w:t>
+            </w:r>
+            <w:r>
+              <w:rPr>
+                <w:rFonts w:hint="default" w:eastAsia="Times New Roman" w:cs="Times New Roman"/>
+                <w:bCs/>
+                <w:sz w:val="20"/>
+                <w:szCs w:val="20"/>
+                <w:lang w:val="en-US"/>
+              </w:rPr>
+              <w:t>oject_owner}</w:t>
             </w:r>
           </w:p>
         </w:tc>
@@ -2946,7 +2982,18 @@
                 <w:highlight w:val="yellow"/>
                 <w:lang w:val="en-US"/>
               </w:rPr>
-              <w:t>{est_cost}</w:t>
+              <w:t>{</w:t>
+            </w:r>
+            <w:r>
+              <w:rPr>
+                <w:rFonts w:hint="default" w:eastAsia="Times New Roman" w:cs="Times New Roman"/>
+                <w:bCs/>
+                <w:sz w:val="20"/>
+                <w:szCs w:val="20"/>
+                <w:highlight w:val="none"/>
+                <w:lang w:val="en-US"/>
+              </w:rPr>
+              <w:t>est_cost}</w:t>
             </w:r>
           </w:p>
         </w:tc>
@@ -2996,16 +3043,17 @@
                 <w:highlight w:val="yellow"/>
                 <w:lang w:val="en-US"/>
               </w:rPr>
-              <w:t>{source_of_funds</w:t>
+              <w:t>{</w:t>
             </w:r>
             <w:r>
               <w:rPr>
                 <w:rFonts w:hint="default" w:eastAsia="Times New Roman" w:cs="Times New Roman"/>
                 <w:sz w:val="20"/>
                 <w:szCs w:val="20"/>
+                <w:highlight w:val="none"/>
                 <w:lang w:val="en-US"/>
               </w:rPr>
-              <w:t>}</w:t>
+              <w:t>source_of_funds}</w:t>
             </w:r>
           </w:p>
         </w:tc>
@@ -3099,7 +3147,18 @@
                 <w:highlight w:val="yellow"/>
                 <w:lang w:val="en-US"/>
               </w:rPr>
-              <w:t>{bidder_selection_time}</w:t>
+              <w:t>{</w:t>
+            </w:r>
+            <w:r>
+              <w:rPr>
+                <w:rFonts w:hint="default" w:eastAsia="Times New Roman" w:cs="Times New Roman"/>
+                <w:bCs/>
+                <w:sz w:val="20"/>
+                <w:szCs w:val="20"/>
+                <w:highlight w:val="none"/>
+                <w:lang w:val="en-US"/>
+              </w:rPr>
+              <w:t>bidder_selection_time}</w:t>
             </w:r>
           </w:p>
         </w:tc>
@@ -3192,13 +3251,25 @@
                 <w:highlight w:val="yellow"/>
                 <w:lang w:val="en-US"/>
               </w:rPr>
-              <w:t>{duration}</w:t>
+              <w:t>{</w:t>
             </w:r>
             <w:r>
               <w:rPr>
                 <w:rFonts w:hint="default" w:eastAsia="Times New Roman" w:cs="Times New Roman"/>
-                <w:sz w:val="20"/>
-                <w:szCs w:val="20"/>
+                <w:bCs/>
+                <w:sz w:val="20"/>
+                <w:szCs w:val="20"/>
+                <w:highlight w:val="none"/>
+                <w:lang w:val="en-US"/>
+              </w:rPr>
+              <w:t>duration}</w:t>
+            </w:r>
+            <w:r>
+              <w:rPr>
+                <w:rFonts w:hint="default" w:eastAsia="Times New Roman" w:cs="Times New Roman"/>
+                <w:sz w:val="20"/>
+                <w:szCs w:val="20"/>
+                <w:highlight w:val="none"/>
                 <w:lang w:val="vi-VN"/>
               </w:rPr>
               <w:t>{</w:t>
@@ -3208,6 +3279,7 @@
                 <w:rFonts w:hint="default" w:eastAsia="Times New Roman" w:cs="Times New Roman"/>
                 <w:sz w:val="20"/>
                 <w:szCs w:val="20"/>
+                <w:highlight w:val="none"/>
                 <w:lang w:val="en-US"/>
               </w:rPr>
               <w:t>/</w:t>
@@ -3228,18 +3300,7 @@
                 <w:szCs w:val="20"/>
                 <w:lang w:val="en-US"/>
               </w:rPr>
-              <w:t>d_p</w:t>
-            </w:r>
-            <w:bookmarkStart w:id="3" w:name="_GoBack"/>
-            <w:bookmarkEnd w:id="3"/>
-            <w:r>
-              <w:rPr>
-                <w:rFonts w:hint="default" w:eastAsia="Times New Roman" w:cs="Times New Roman"/>
-                <w:sz w:val="20"/>
-                <w:szCs w:val="20"/>
-                <w:lang w:val="en-US"/>
-              </w:rPr>
-              <w:t>ackages</w:t>
+              <w:t>d_packages</w:t>
             </w:r>
             <w:r>
               <w:rPr>
@@ -3272,456 +3333,6 @@
         </w:tblPrEx>
         <w:tc>
           <w:tcPr>
-            <w:tcW w:w="572" w:type="dxa"/>
-            <w:tcBorders>
-              <w:top w:val="single" w:color="auto" w:sz="4" w:space="0"/>
-              <w:left w:val="single" w:color="auto" w:sz="4" w:space="0"/>
-              <w:bottom w:val="single" w:color="auto" w:sz="4" w:space="0"/>
-              <w:right w:val="single" w:color="auto" w:sz="4" w:space="0"/>
-            </w:tcBorders>
-            <w:noWrap w:val="0"/>
-            <w:vAlign w:val="center"/>
-          </w:tcPr>
-          <w:p>
-            <w:pPr>
-              <w:keepNext w:val="0"/>
-              <w:keepLines w:val="0"/>
-              <w:widowControl/>
-              <w:suppressLineNumbers w:val="0"/>
-              <w:spacing w:before="0" w:beforeAutospacing="0" w:after="0" w:afterAutospacing="0"/>
-              <w:ind w:left="0" w:right="0"/>
-              <w:jc w:val="center"/>
-              <w:rPr>
-                <w:rFonts w:hint="default" w:ascii="Times New Roman" w:hAnsi="Times New Roman" w:eastAsia="Times New Roman" w:cs="Times New Roman"/>
-                <w:sz w:val="20"/>
-                <w:szCs w:val="20"/>
-              </w:rPr>
-            </w:pPr>
-            <w:r>
-              <w:rPr>
-                <w:rFonts w:hint="default" w:ascii="Times New Roman" w:hAnsi="Times New Roman" w:eastAsia="Times New Roman" w:cs="Times New Roman"/>
-                <w:sz w:val="20"/>
-                <w:szCs w:val="20"/>
-              </w:rPr>
-              <w:t>2</w:t>
-            </w:r>
-          </w:p>
-        </w:tc>
-        <w:tc>
-          <w:tcPr>
-            <w:tcW w:w="711" w:type="dxa"/>
-            <w:tcBorders>
-              <w:top w:val="single" w:color="auto" w:sz="4" w:space="0"/>
-              <w:left w:val="single" w:color="auto" w:sz="4" w:space="0"/>
-              <w:bottom w:val="single" w:color="auto" w:sz="4" w:space="0"/>
-              <w:right w:val="single" w:color="auto" w:sz="4" w:space="0"/>
-            </w:tcBorders>
-            <w:noWrap w:val="0"/>
-            <w:vAlign w:val="center"/>
-          </w:tcPr>
-          <w:p>
-            <w:pPr>
-              <w:keepNext w:val="0"/>
-              <w:keepLines w:val="0"/>
-              <w:widowControl/>
-              <w:suppressLineNumbers w:val="0"/>
-              <w:spacing w:before="0" w:beforeAutospacing="0" w:after="0" w:afterAutospacing="0"/>
-              <w:ind w:left="0" w:right="0"/>
-              <w:jc w:val="center"/>
-              <w:rPr>
-                <w:rFonts w:hint="default" w:ascii="Times New Roman" w:hAnsi="Times New Roman" w:eastAsia="Times New Roman" w:cs="Times New Roman"/>
-                <w:bCs/>
-                <w:sz w:val="20"/>
-                <w:szCs w:val="20"/>
-              </w:rPr>
-            </w:pPr>
-            <w:r>
-              <w:rPr>
-                <w:rFonts w:hint="default" w:ascii="Times New Roman" w:hAnsi="Times New Roman" w:eastAsia="Times New Roman" w:cs="Times New Roman"/>
-                <w:bCs/>
-                <w:sz w:val="20"/>
-                <w:szCs w:val="20"/>
-              </w:rPr>
-              <w:t>Công ty Trực thăng Miền Nam</w:t>
-            </w:r>
-          </w:p>
-        </w:tc>
-        <w:tc>
-          <w:tcPr>
-            <w:tcW w:w="840" w:type="dxa"/>
-            <w:tcBorders>
-              <w:top w:val="single" w:color="auto" w:sz="4" w:space="0"/>
-              <w:left w:val="single" w:color="auto" w:sz="4" w:space="0"/>
-              <w:bottom w:val="single" w:color="auto" w:sz="4" w:space="0"/>
-              <w:right w:val="single" w:color="auto" w:sz="4" w:space="0"/>
-            </w:tcBorders>
-            <w:noWrap w:val="0"/>
-            <w:vAlign w:val="center"/>
-          </w:tcPr>
-          <w:p>
-            <w:pPr>
-              <w:keepNext w:val="0"/>
-              <w:keepLines w:val="0"/>
-              <w:widowControl/>
-              <w:suppressLineNumbers w:val="0"/>
-              <w:spacing w:before="0" w:beforeAutospacing="0" w:after="0" w:afterAutospacing="0"/>
-              <w:ind w:left="0" w:right="0"/>
-              <w:jc w:val="center"/>
-              <w:rPr>
-                <w:rFonts w:hint="default" w:ascii="Times New Roman" w:hAnsi="Times New Roman" w:eastAsia="Times New Roman" w:cs="Times New Roman"/>
-                <w:sz w:val="20"/>
-                <w:szCs w:val="20"/>
-              </w:rPr>
-            </w:pPr>
-            <w:r>
-              <w:rPr>
-                <w:rFonts w:hint="default" w:ascii="Times New Roman" w:hAnsi="Times New Roman" w:eastAsia="Times New Roman" w:cs="Times New Roman"/>
-                <w:bCs/>
-                <w:sz w:val="20"/>
-                <w:szCs w:val="20"/>
-              </w:rPr>
-              <w:t>Tư vấn Thẩm tra BCKTKT</w:t>
-            </w:r>
-          </w:p>
-        </w:tc>
-        <w:tc>
-          <w:tcPr>
-            <w:tcW w:w="1265" w:type="dxa"/>
-            <w:tcBorders>
-              <w:top w:val="single" w:color="auto" w:sz="4" w:space="0"/>
-              <w:left w:val="single" w:color="auto" w:sz="4" w:space="0"/>
-              <w:bottom w:val="single" w:color="auto" w:sz="4" w:space="0"/>
-              <w:right w:val="single" w:color="auto" w:sz="4" w:space="0"/>
-            </w:tcBorders>
-            <w:noWrap w:val="0"/>
-            <w:vAlign w:val="center"/>
-          </w:tcPr>
-          <w:p>
-            <w:pPr>
-              <w:keepNext w:val="0"/>
-              <w:keepLines w:val="0"/>
-              <w:widowControl/>
-              <w:suppressLineNumbers w:val="0"/>
-              <w:spacing w:before="0" w:beforeAutospacing="0" w:after="0" w:afterAutospacing="0"/>
-              <w:ind w:left="0" w:right="0"/>
-              <w:jc w:val="center"/>
-              <w:rPr>
-                <w:rFonts w:hint="default" w:ascii="Times New Roman" w:hAnsi="Times New Roman" w:eastAsia="Times New Roman" w:cs="Times New Roman"/>
-                <w:sz w:val="20"/>
-                <w:szCs w:val="20"/>
-              </w:rPr>
-            </w:pPr>
-            <w:r>
-              <w:rPr>
-                <w:rFonts w:hint="default" w:ascii="Times New Roman" w:hAnsi="Times New Roman" w:eastAsia="Times New Roman" w:cs="Times New Roman"/>
-                <w:sz w:val="20"/>
-                <w:szCs w:val="20"/>
-              </w:rPr>
-              <w:t>Thẩm tra bản vẽ thiết kế kỹ thuật thi công, dự toán công trình</w:t>
-            </w:r>
-          </w:p>
-        </w:tc>
-        <w:tc>
-          <w:tcPr>
-            <w:tcW w:w="1149" w:type="dxa"/>
-            <w:tcBorders>
-              <w:top w:val="single" w:color="auto" w:sz="4" w:space="0"/>
-              <w:left w:val="single" w:color="auto" w:sz="4" w:space="0"/>
-              <w:bottom w:val="single" w:color="auto" w:sz="4" w:space="0"/>
-              <w:right w:val="single" w:color="auto" w:sz="4" w:space="0"/>
-            </w:tcBorders>
-            <w:noWrap w:val="0"/>
-            <w:vAlign w:val="center"/>
-          </w:tcPr>
-          <w:p>
-            <w:pPr>
-              <w:keepNext w:val="0"/>
-              <w:keepLines w:val="0"/>
-              <w:widowControl/>
-              <w:suppressLineNumbers w:val="0"/>
-              <w:spacing w:before="0" w:beforeAutospacing="0" w:after="0" w:afterAutospacing="0"/>
-              <w:ind w:left="0" w:right="0"/>
-              <w:jc w:val="center"/>
-              <w:rPr>
-                <w:rFonts w:hint="default" w:ascii="Times New Roman" w:hAnsi="Times New Roman" w:eastAsia="Times New Roman" w:cs="Times New Roman"/>
-                <w:bCs/>
-                <w:sz w:val="20"/>
-                <w:szCs w:val="20"/>
-                <w:highlight w:val="yellow"/>
-              </w:rPr>
-            </w:pPr>
-            <w:r>
-              <w:rPr>
-                <w:rFonts w:hint="default" w:ascii="Times New Roman" w:hAnsi="Times New Roman" w:eastAsia="Times New Roman" w:cs="Times New Roman"/>
-                <w:bCs/>
-                <w:sz w:val="20"/>
-                <w:szCs w:val="20"/>
-                <w:highlight w:val="yellow"/>
-              </w:rPr>
-              <w:t>5.000.000</w:t>
-            </w:r>
-          </w:p>
-        </w:tc>
-        <w:tc>
-          <w:tcPr>
-            <w:tcW w:w="700" w:type="dxa"/>
-            <w:tcBorders>
-              <w:top w:val="single" w:color="auto" w:sz="4" w:space="0"/>
-              <w:left w:val="single" w:color="auto" w:sz="4" w:space="0"/>
-              <w:bottom w:val="single" w:color="auto" w:sz="4" w:space="0"/>
-              <w:right w:val="single" w:color="auto" w:sz="4" w:space="0"/>
-            </w:tcBorders>
-            <w:noWrap w:val="0"/>
-            <w:vAlign w:val="center"/>
-          </w:tcPr>
-          <w:p>
-            <w:pPr>
-              <w:keepNext w:val="0"/>
-              <w:keepLines w:val="0"/>
-              <w:widowControl/>
-              <w:suppressLineNumbers w:val="0"/>
-              <w:spacing w:before="0" w:beforeAutospacing="0" w:after="0" w:afterAutospacing="0"/>
-              <w:ind w:left="0" w:right="0"/>
-              <w:jc w:val="center"/>
-              <w:rPr>
-                <w:rFonts w:hint="default" w:ascii="Times New Roman" w:hAnsi="Times New Roman" w:eastAsia="Times New Roman" w:cs="Times New Roman"/>
-                <w:bCs/>
-                <w:sz w:val="20"/>
-                <w:szCs w:val="20"/>
-                <w:highlight w:val="yellow"/>
-              </w:rPr>
-            </w:pPr>
-            <w:r>
-              <w:rPr>
-                <w:rFonts w:hint="default" w:ascii="Times New Roman" w:hAnsi="Times New Roman" w:eastAsia="Times New Roman" w:cs="Times New Roman"/>
-                <w:sz w:val="20"/>
-                <w:szCs w:val="20"/>
-              </w:rPr>
-              <w:t xml:space="preserve">Chi phí SXKD năm </w:t>
-            </w:r>
-            <w:r>
-              <w:rPr>
-                <w:rFonts w:hint="default" w:ascii="Times New Roman" w:hAnsi="Times New Roman" w:eastAsia="Times New Roman" w:cs="Times New Roman"/>
-                <w:sz w:val="20"/>
-                <w:szCs w:val="20"/>
-                <w:highlight w:val="yellow"/>
-              </w:rPr>
-              <w:t>2025</w:t>
-            </w:r>
-          </w:p>
-        </w:tc>
-        <w:tc>
-          <w:tcPr>
-            <w:tcW w:w="951" w:type="dxa"/>
-            <w:tcBorders>
-              <w:top w:val="single" w:color="auto" w:sz="4" w:space="0"/>
-              <w:left w:val="single" w:color="auto" w:sz="4" w:space="0"/>
-              <w:bottom w:val="single" w:color="auto" w:sz="4" w:space="0"/>
-              <w:right w:val="single" w:color="auto" w:sz="4" w:space="0"/>
-            </w:tcBorders>
-            <w:noWrap w:val="0"/>
-            <w:vAlign w:val="center"/>
-          </w:tcPr>
-          <w:p>
-            <w:pPr>
-              <w:keepNext w:val="0"/>
-              <w:keepLines w:val="0"/>
-              <w:widowControl/>
-              <w:suppressLineNumbers w:val="0"/>
-              <w:spacing w:before="0" w:beforeAutospacing="0" w:after="0" w:afterAutospacing="0"/>
-              <w:ind w:left="0" w:right="0"/>
-              <w:jc w:val="center"/>
-              <w:rPr>
-                <w:rFonts w:hint="default" w:ascii="Times New Roman" w:hAnsi="Times New Roman" w:eastAsia="Times New Roman" w:cs="Times New Roman"/>
-                <w:bCs/>
-                <w:sz w:val="20"/>
-                <w:szCs w:val="20"/>
-              </w:rPr>
-            </w:pPr>
-            <w:r>
-              <w:rPr>
-                <w:rFonts w:hint="default" w:ascii="Times New Roman" w:hAnsi="Times New Roman" w:eastAsia="Times New Roman" w:cs="Times New Roman"/>
-                <w:bCs/>
-                <w:sz w:val="20"/>
-                <w:szCs w:val="20"/>
-              </w:rPr>
-              <w:t>Chỉ định thầu</w:t>
-            </w:r>
-          </w:p>
-          <w:p>
-            <w:pPr>
-              <w:keepNext w:val="0"/>
-              <w:keepLines w:val="0"/>
-              <w:widowControl/>
-              <w:suppressLineNumbers w:val="0"/>
-              <w:spacing w:before="0" w:beforeAutospacing="0" w:after="0" w:afterAutospacing="0"/>
-              <w:ind w:left="0" w:right="0"/>
-              <w:jc w:val="center"/>
-              <w:rPr>
-                <w:rFonts w:hint="default" w:ascii="Times New Roman" w:hAnsi="Times New Roman" w:eastAsia="Times New Roman" w:cs="Times New Roman"/>
-                <w:bCs/>
-                <w:sz w:val="20"/>
-                <w:szCs w:val="20"/>
-              </w:rPr>
-            </w:pPr>
-            <w:r>
-              <w:rPr>
-                <w:rFonts w:hint="default" w:ascii="Times New Roman" w:hAnsi="Times New Roman" w:eastAsia="Times New Roman" w:cs="Times New Roman"/>
-                <w:bCs/>
-                <w:sz w:val="20"/>
-                <w:szCs w:val="20"/>
-              </w:rPr>
-              <w:t>rút gọn</w:t>
-            </w:r>
-          </w:p>
-        </w:tc>
-        <w:tc>
-          <w:tcPr>
-            <w:tcW w:w="1120" w:type="dxa"/>
-            <w:tcBorders>
-              <w:top w:val="single" w:color="auto" w:sz="4" w:space="0"/>
-              <w:left w:val="single" w:color="auto" w:sz="4" w:space="0"/>
-              <w:bottom w:val="single" w:color="auto" w:sz="4" w:space="0"/>
-              <w:right w:val="single" w:color="auto" w:sz="4" w:space="0"/>
-            </w:tcBorders>
-            <w:noWrap w:val="0"/>
-            <w:vAlign w:val="center"/>
-          </w:tcPr>
-          <w:p>
-            <w:pPr>
-              <w:keepNext w:val="0"/>
-              <w:keepLines w:val="0"/>
-              <w:widowControl/>
-              <w:suppressLineNumbers w:val="0"/>
-              <w:spacing w:before="0" w:beforeAutospacing="0" w:after="0" w:afterAutospacing="0"/>
-              <w:ind w:left="0" w:right="0"/>
-              <w:jc w:val="center"/>
-              <w:rPr>
-                <w:rFonts w:hint="default" w:ascii="Times New Roman" w:hAnsi="Times New Roman" w:eastAsia="Times New Roman" w:cs="Times New Roman"/>
-                <w:bCs/>
-                <w:sz w:val="20"/>
-                <w:szCs w:val="20"/>
-                <w:highlight w:val="yellow"/>
-              </w:rPr>
-            </w:pPr>
-            <w:r>
-              <w:rPr>
-                <w:rFonts w:hint="default" w:ascii="Times New Roman" w:hAnsi="Times New Roman" w:eastAsia="Times New Roman" w:cs="Times New Roman"/>
-                <w:bCs/>
-                <w:sz w:val="20"/>
-                <w:szCs w:val="20"/>
-                <w:highlight w:val="yellow"/>
-              </w:rPr>
-              <w:t>Tháng 10/2025</w:t>
-            </w:r>
-          </w:p>
-        </w:tc>
-        <w:tc>
-          <w:tcPr>
-            <w:tcW w:w="840" w:type="dxa"/>
-            <w:tcBorders>
-              <w:top w:val="single" w:color="auto" w:sz="4" w:space="0"/>
-              <w:left w:val="single" w:color="auto" w:sz="4" w:space="0"/>
-              <w:bottom w:val="single" w:color="auto" w:sz="4" w:space="0"/>
-              <w:right w:val="single" w:color="auto" w:sz="4" w:space="0"/>
-            </w:tcBorders>
-            <w:noWrap w:val="0"/>
-            <w:tcMar>
-              <w:top w:w="0" w:type="dxa"/>
-              <w:left w:w="108" w:type="dxa"/>
-              <w:bottom w:w="0" w:type="dxa"/>
-              <w:right w:w="108" w:type="dxa"/>
-            </w:tcMar>
-            <w:vAlign w:val="center"/>
-          </w:tcPr>
-          <w:p>
-            <w:pPr>
-              <w:keepNext w:val="0"/>
-              <w:keepLines w:val="0"/>
-              <w:widowControl/>
-              <w:suppressLineNumbers w:val="0"/>
-              <w:spacing w:before="0" w:beforeAutospacing="0" w:after="0" w:afterAutospacing="0"/>
-              <w:ind w:left="0" w:right="0"/>
-              <w:jc w:val="center"/>
-              <w:rPr>
-                <w:rFonts w:hint="default" w:ascii="Times New Roman" w:hAnsi="Times New Roman" w:eastAsia="Times New Roman" w:cs="Times New Roman"/>
-                <w:bCs/>
-                <w:sz w:val="20"/>
-                <w:szCs w:val="20"/>
-              </w:rPr>
-            </w:pPr>
-            <w:r>
-              <w:rPr>
-                <w:rFonts w:hint="default" w:ascii="Times New Roman" w:hAnsi="Times New Roman" w:eastAsia="Times New Roman" w:cs="Times New Roman"/>
-                <w:bCs/>
-                <w:sz w:val="20"/>
-                <w:szCs w:val="20"/>
-              </w:rPr>
-              <w:t>Trọn gói</w:t>
-            </w:r>
-          </w:p>
-        </w:tc>
-        <w:tc>
-          <w:tcPr>
-            <w:tcW w:w="980" w:type="dxa"/>
-            <w:tcBorders>
-              <w:top w:val="single" w:color="auto" w:sz="4" w:space="0"/>
-              <w:left w:val="single" w:color="auto" w:sz="4" w:space="0"/>
-              <w:bottom w:val="single" w:color="auto" w:sz="4" w:space="0"/>
-              <w:right w:val="single" w:color="auto" w:sz="4" w:space="0"/>
-            </w:tcBorders>
-            <w:noWrap w:val="0"/>
-            <w:tcMar>
-              <w:top w:w="0" w:type="dxa"/>
-              <w:left w:w="108" w:type="dxa"/>
-              <w:bottom w:w="0" w:type="dxa"/>
-              <w:right w:w="108" w:type="dxa"/>
-            </w:tcMar>
-            <w:vAlign w:val="center"/>
-          </w:tcPr>
-          <w:p>
-            <w:pPr>
-              <w:keepNext w:val="0"/>
-              <w:keepLines w:val="0"/>
-              <w:widowControl/>
-              <w:suppressLineNumbers w:val="0"/>
-              <w:spacing w:before="0" w:beforeAutospacing="0" w:after="0" w:afterAutospacing="0"/>
-              <w:ind w:left="0" w:right="0"/>
-              <w:jc w:val="center"/>
-              <w:rPr>
-                <w:rFonts w:hint="default" w:ascii="Times New Roman" w:hAnsi="Times New Roman" w:eastAsia="Times New Roman" w:cs="Times New Roman"/>
-                <w:bCs/>
-                <w:sz w:val="20"/>
-                <w:szCs w:val="20"/>
-                <w:highlight w:val="yellow"/>
-              </w:rPr>
-            </w:pPr>
-            <w:r>
-              <w:rPr>
-                <w:rFonts w:hint="default" w:ascii="Times New Roman" w:hAnsi="Times New Roman" w:eastAsia="Times New Roman" w:cs="Times New Roman"/>
-                <w:bCs/>
-                <w:sz w:val="20"/>
-                <w:szCs w:val="20"/>
-                <w:highlight w:val="yellow"/>
-              </w:rPr>
-              <w:t>07 ngày</w:t>
-            </w:r>
-          </w:p>
-        </w:tc>
-      </w:tr>
-      <w:tr>
-        <w:tblPrEx>
-          <w:tblBorders>
-            <w:top w:val="single" w:color="auto" w:sz="4" w:space="0"/>
-            <w:left w:val="single" w:color="auto" w:sz="4" w:space="0"/>
-            <w:bottom w:val="single" w:color="auto" w:sz="4" w:space="0"/>
-            <w:right w:val="single" w:color="auto" w:sz="4" w:space="0"/>
-            <w:insideH w:val="single" w:color="auto" w:sz="4" w:space="0"/>
-            <w:insideV w:val="single" w:color="auto" w:sz="4" w:space="0"/>
-          </w:tblBorders>
-        </w:tblPrEx>
-        <w:tc>
-          <w:tcPr>
             <w:tcW w:w="3388" w:type="dxa"/>
             <w:gridSpan w:val="4"/>
             <w:tcBorders>
@@ -3795,18 +3406,56 @@
                 <w:sz w:val="20"/>
                 <w:szCs w:val="20"/>
                 <w:highlight w:val="yellow"/>
-              </w:rPr>
-            </w:pPr>
-            <w:r>
-              <w:rPr>
-                <w:rFonts w:hint="default" w:ascii="Times New Roman" w:hAnsi="Times New Roman" w:eastAsia="Times New Roman" w:cs="Times New Roman"/>
+                <w:lang w:val="vi-VN"/>
+              </w:rPr>
+            </w:pPr>
+            <w:r>
+              <w:rPr>
+                <w:rFonts w:hint="default" w:eastAsia="Times New Roman" w:cs="Times New Roman"/>
                 <w:b/>
                 <w:bCs/>
                 <w:sz w:val="20"/>
                 <w:szCs w:val="20"/>
                 <w:highlight w:val="yellow"/>
-              </w:rPr>
-              <w:t>48.000.000</w:t>
+                <w:lang w:val="vi-VN"/>
+              </w:rPr>
+              <w:t>{</w:t>
+            </w:r>
+            <w:r>
+              <w:rPr>
+                <w:rFonts w:hint="default" w:eastAsia="Times New Roman" w:cs="Times New Roman"/>
+                <w:b/>
+                <w:bCs/>
+                <w:sz w:val="20"/>
+                <w:szCs w:val="20"/>
+                <w:highlight w:val="none"/>
+                <w:lang w:val="vi-VN"/>
+              </w:rPr>
+              <w:t>bid</w:t>
+            </w:r>
+            <w:r>
+              <w:rPr>
+                <w:rFonts w:hint="default" w:eastAsia="Times New Roman" w:cs="Times New Roman"/>
+                <w:b/>
+                <w:bCs/>
+                <w:sz w:val="20"/>
+                <w:szCs w:val="20"/>
+                <w:highlight w:val="none"/>
+                <w:lang w:val="en-US"/>
+              </w:rPr>
+              <w:t>_package_total</w:t>
+            </w:r>
+            <w:r>
+              <w:rPr>
+                <w:rFonts w:hint="default" w:eastAsia="Times New Roman" w:cs="Times New Roman"/>
+                <w:b/>
+                <w:bCs/>
+                <w:sz w:val="20"/>
+                <w:szCs w:val="20"/>
+                <w:highlight w:val="none"/>
+                <w:lang w:val="vi-VN"/>
+              </w:rPr>
+              <w:t>}</w:t>
             </w:r>
           </w:p>
         </w:tc>
@@ -4085,7 +3734,15 @@
           <w:highlight w:val="yellow"/>
           <w:lang w:val="en-US"/>
         </w:rPr>
-        <w:t>{source_of_funds}</w:t>
+        <w:t>{</w:t>
+      </w:r>
+      <w:r>
+        <w:rPr>
+          <w:rFonts w:hint="default"/>
+          <w:highlight w:val="none"/>
+          <w:lang w:val="en-US"/>
+        </w:rPr>
+        <w:t>source_of_funds}</w:t>
       </w:r>
       <w:r>
         <w:rPr>
@@ -4198,7 +3855,37 @@
           <w:rFonts w:eastAsia="Times New Roman"/>
           <w:lang w:val="it-IT"/>
         </w:rPr>
-        <w:t>đ) Thời gian bắt đầu tổ chức lựa chọn nhà thầu: Tháng 10/2025 (sau khi có Quyết định phê duyệt Kế hoạch lựa chọn nhà thầu)</w:t>
+        <w:t xml:space="preserve">đ) Thời gian bắt đầu tổ chức lựa chọn nhà thầu: </w:t>
+      </w:r>
+      <w:r>
+        <w:rPr>
+          <w:rFonts w:hint="default" w:eastAsia="Times New Roman"/>
+          <w:highlight w:val="yellow"/>
+          <w:lang w:val="vi-VN"/>
+        </w:rPr>
+        <w:t>{</w:t>
+      </w:r>
+      <w:r>
+        <w:rPr>
+          <w:rFonts w:hint="default" w:eastAsia="Times New Roman"/>
+          <w:highlight w:val="none"/>
+          <w:lang w:val="en-US"/>
+        </w:rPr>
+        <w:t>bid_packages[0].bidder_selection_time</w:t>
+      </w:r>
+      <w:r>
+        <w:rPr>
+          <w:rFonts w:hint="default" w:eastAsia="Times New Roman"/>
+          <w:lang w:val="vi-VN"/>
+        </w:rPr>
+        <w:t>}</w:t>
+      </w:r>
+      <w:r>
+        <w:rPr>
+          <w:rFonts w:eastAsia="Times New Roman"/>
+          <w:lang w:val="it-IT"/>
+        </w:rPr>
+        <w:t xml:space="preserve"> (sau khi có Quyết định phê duyệt Kế hoạch lựa chọn nhà thầu)</w:t>
       </w:r>
     </w:p>
     <w:p>
@@ -4273,7 +3960,23 @@
           <w:highlight w:val="yellow"/>
           <w:lang w:val="en-US"/>
         </w:rPr>
-        <w:t>{bidPackages[0].duration}</w:t>
+        <w:t>{bid</w:t>
+      </w:r>
+      <w:r>
+        <w:rPr>
+          <w:rFonts w:hint="default" w:eastAsia="Times New Roman"/>
+          <w:highlight w:val="yellow"/>
+          <w:lang w:val="vi-VN"/>
+        </w:rPr>
+        <w:t>_p</w:t>
+      </w:r>
+      <w:r>
+        <w:rPr>
+          <w:rFonts w:hint="default" w:eastAsia="Times New Roman"/>
+          <w:highlight w:val="yellow"/>
+          <w:lang w:val="en-US"/>
+        </w:rPr>
+        <w:t>ackages[0].duration}</w:t>
       </w:r>
       <w:r>
         <w:rPr>
@@ -4311,7 +4014,7 @@
           <w:highlight w:val="yellow"/>
           <w:lang w:val="en-US"/>
         </w:rPr>
-        <w:t>{bidPackages[1].duration}</w:t>
+        <w:t>{bid_packages[1].duration}</w:t>
       </w:r>
       <w:r>
         <w:rPr>
@@ -5100,8 +4803,8 @@
     <w:lsdException w:unhideWhenUsed="0" w:uiPriority="0" w:semiHidden="0" w:name="Normal Indent"/>
     <w:lsdException w:unhideWhenUsed="0" w:uiPriority="0" w:semiHidden="0" w:name="footnote text"/>
     <w:lsdException w:unhideWhenUsed="0" w:uiPriority="0" w:semiHidden="0" w:name="annotation text"/>
-    <w:lsdException w:unhideWhenUsed="0" w:uiPriority="0" w:semiHidden="0" w:name="header"/>
-    <w:lsdException w:unhideWhenUsed="0" w:uiPriority="0" w:semiHidden="0" w:name="footer"/>
+    <w:lsdException w:qFormat="1" w:unhideWhenUsed="0" w:uiPriority="0" w:semiHidden="0" w:name="header"/>
+    <w:lsdException w:qFormat="1" w:unhideWhenUsed="0" w:uiPriority="0" w:semiHidden="0" w:name="footer"/>
     <w:lsdException w:unhideWhenUsed="0" w:uiPriority="0" w:semiHidden="0" w:name="index heading"/>
     <w:lsdException w:qFormat="1" w:uiPriority="0" w:name="caption"/>
     <w:lsdException w:unhideWhenUsed="0" w:uiPriority="0" w:semiHidden="0" w:name="table of figures"/>
@@ -5110,7 +4813,7 @@
     <w:lsdException w:unhideWhenUsed="0" w:uiPriority="0" w:semiHidden="0" w:name="footnote reference"/>
     <w:lsdException w:unhideWhenUsed="0" w:uiPriority="0" w:semiHidden="0" w:name="annotation reference"/>
     <w:lsdException w:unhideWhenUsed="0" w:uiPriority="0" w:semiHidden="0" w:name="line number"/>
-    <w:lsdException w:unhideWhenUsed="0" w:uiPriority="0" w:semiHidden="0" w:name="page number"/>
+    <w:lsdException w:qFormat="1" w:unhideWhenUsed="0" w:uiPriority="0" w:semiHidden="0" w:name="page number"/>
     <w:lsdException w:unhideWhenUsed="0" w:uiPriority="0" w:semiHidden="0" w:name="endnote reference"/>
     <w:lsdException w:unhideWhenUsed="0" w:uiPriority="0" w:semiHidden="0" w:name="endnote text"/>
     <w:lsdException w:unhideWhenUsed="0" w:uiPriority="0" w:semiHidden="0" w:name="table of authorities"/>
@@ -5123,7 +4826,7 @@
     <w:lsdException w:unhideWhenUsed="0" w:uiPriority="0" w:semiHidden="0" w:name="List 3"/>
     <w:lsdException w:unhideWhenUsed="0" w:uiPriority="0" w:semiHidden="0" w:name="List 4"/>
     <w:lsdException w:unhideWhenUsed="0" w:uiPriority="0" w:semiHidden="0" w:name="List 5"/>
-    <w:lsdException w:unhideWhenUsed="0" w:uiPriority="0" w:semiHidden="0" w:name="List Bullet 2"/>
+    <w:lsdException w:qFormat="1" w:unhideWhenUsed="0" w:uiPriority="0" w:semiHidden="0" w:name="List Bullet 2"/>
     <w:lsdException w:unhideWhenUsed="0" w:uiPriority="0" w:semiHidden="0" w:name="List Bullet 3"/>
     <w:lsdException w:unhideWhenUsed="0" w:uiPriority="0" w:semiHidden="0" w:name="List Bullet 4"/>
     <w:lsdException w:unhideWhenUsed="0" w:uiPriority="0" w:semiHidden="0" w:name="List Bullet 5"/>
@@ -5216,8 +4919,8 @@
     <w:lsdException w:unhideWhenUsed="0" w:uiPriority="0" w:semiHidden="0" w:name="Table Web 1"/>
     <w:lsdException w:unhideWhenUsed="0" w:uiPriority="0" w:semiHidden="0" w:name="Table Web 2"/>
     <w:lsdException w:unhideWhenUsed="0" w:uiPriority="0" w:semiHidden="0" w:name="Table Web 3"/>
-    <w:lsdException w:unhideWhenUsed="0" w:uiPriority="0" w:name="Balloon Text"/>
-    <w:lsdException w:unhideWhenUsed="0" w:uiPriority="39" w:semiHidden="0" w:name="Table Grid"/>
+    <w:lsdException w:qFormat="1" w:unhideWhenUsed="0" w:uiPriority="0" w:name="Balloon Text"/>
+    <w:lsdException w:qFormat="1" w:unhideWhenUsed="0" w:uiPriority="39" w:semiHidden="0" w:name="Table Grid"/>
     <w:lsdException w:unhideWhenUsed="0" w:uiPriority="0" w:semiHidden="0" w:name="Table Theme"/>
     <w:lsdException w:unhideWhenUsed="0" w:uiPriority="60" w:semiHidden="0" w:name="Light Shading"/>
     <w:lsdException w:unhideWhenUsed="0" w:uiPriority="61" w:semiHidden="0" w:name="Light List"/>
@@ -5398,6 +5101,7 @@
     <w:name w:val="Balloon Text"/>
     <w:basedOn w:val="1"/>
     <w:semiHidden/>
+    <w:qFormat/>
     <w:uiPriority w:val="0"/>
     <w:rPr>
       <w:rFonts w:ascii="Tahoma" w:hAnsi="Tahoma" w:cs="Tahoma"/>
@@ -5408,6 +5112,7 @@
   <w:style w:type="paragraph" w:styleId="7">
     <w:name w:val="footer"/>
     <w:basedOn w:val="1"/>
+    <w:qFormat/>
     <w:uiPriority w:val="0"/>
     <w:pPr>
       <w:tabs>
@@ -5419,6 +5124,7 @@
   <w:style w:type="paragraph" w:styleId="8">
     <w:name w:val="header"/>
     <w:basedOn w:val="1"/>
+    <w:qFormat/>
     <w:uiPriority w:val="0"/>
     <w:pPr>
       <w:tabs>
@@ -5430,6 +5136,7 @@
   <w:style w:type="paragraph" w:styleId="9">
     <w:name w:val="List Bullet 2"/>
     <w:basedOn w:val="1"/>
+    <w:qFormat/>
     <w:uiPriority w:val="0"/>
     <w:pPr>
       <w:numPr>
@@ -5447,11 +5154,13 @@
   </w:style>
   <w:style w:type="character" w:styleId="10">
     <w:name w:val="page number"/>
+    <w:qFormat/>
     <w:uiPriority w:val="0"/>
   </w:style>
   <w:style w:type="table" w:styleId="11">
     <w:name w:val="Table Grid"/>
     <w:basedOn w:val="5"/>
+    <w:qFormat/>
     <w:uiPriority w:val="39"/>
     <w:rPr>
       <w:lang w:bidi="ar-SA"/>
@@ -5469,6 +5178,7 @@
   </w:style>
   <w:style w:type="paragraph" w:customStyle="1" w:styleId="12">
     <w:name w:val=" Char"/>
+    <w:qFormat/>
     <w:uiPriority w:val="0"/>
     <w:pPr>
       <w:tabs>
@@ -5486,6 +5196,7 @@
   <w:style w:type="paragraph" w:customStyle="1" w:styleId="13">
     <w:name w:val="Char Char1 Char"/>
     <w:basedOn w:val="1"/>
+    <w:qFormat/>
     <w:uiPriority w:val="0"/>
     <w:pPr>
       <w:widowControl w:val="0"/>
@@ -5500,6 +5211,7 @@
   </w:style>
   <w:style w:type="paragraph" w:customStyle="1" w:styleId="14">
     <w:name w:val=" Char Char Char Char Char Char Char"/>
+    <w:qFormat/>
     <w:uiPriority w:val="0"/>
     <w:pPr>
       <w:tabs>
@@ -5518,6 +5230,7 @@
     <w:name w:val="1"/>
     <w:basedOn w:val="1"/>
     <w:link w:val="16"/>
+    <w:qFormat/>
     <w:uiPriority w:val="0"/>
     <w:pPr>
       <w:autoSpaceDE w:val="0"/>
@@ -5536,6 +5249,7 @@
   <w:style w:type="character" w:customStyle="1" w:styleId="16">
     <w:name w:val="1.Tiêu đề Char Char"/>
     <w:link w:val="15"/>
+    <w:qFormat/>
     <w:uiPriority w:val="0"/>
     <w:rPr>
       <w:rFonts w:eastAsia="Times New Roman"/>

</xml_diff>